<commit_message>
Sync the Word findings backup with the question hierarchy
Replaces the canonical docx with the revised backup, including the three-level question hierarchy and refreshed table of contents.

Co-Authored-By: Claude Fable 5.1 <noreply@anthropic.com>
</commit_message>
<xml_diff>
--- a/文档/Project10_四个Findings的逻辑底稿_20261019.docx
+++ b/文档/Project10_四个Findings的逻辑底稿_20261019.docx
@@ -176,7 +176,7 @@
         </w:rPr>
         <w:fldChar w:fldCharType="separate"/>
       </w:r>
-      <w:hyperlink w:anchor="_Toc243297009" w:history="1">
+      <w:hyperlink w:anchor="_Toc243297571" w:history="1">
         <w:r>
           <w:rPr>
             <w:rStyle w:val="aff9"/>
@@ -222,7 +222,7 @@
             <w:noProof/>
             <w:webHidden/>
           </w:rPr>
-          <w:instrText>PAGEREF _Toc243297009 \h</w:instrText>
+          <w:instrText>PAGEREF _Toc243297571 \h</w:instrText>
         </w:r>
         <w:r>
           <w:rPr>
@@ -252,7 +252,7 @@
             <w:noProof/>
             <w:webHidden/>
           </w:rPr>
-          <w:t>2</w:t>
+          <w:t>3</w:t>
         </w:r>
         <w:r>
           <w:rPr>
@@ -280,7 +280,7 @@
           <w14:ligatures w14:val="standardContextual"/>
         </w:rPr>
       </w:pPr>
-      <w:hyperlink w:anchor="_Toc243297010" w:history="1">
+      <w:hyperlink w:anchor="_Toc243297572" w:history="1">
         <w:r>
           <w:rPr>
             <w:rStyle w:val="aff9"/>
@@ -326,7 +326,7 @@
             <w:noProof/>
             <w:webHidden/>
           </w:rPr>
-          <w:instrText>PAGEREF _Toc243297010 \h</w:instrText>
+          <w:instrText>PAGEREF _Toc243297572 \h</w:instrText>
         </w:r>
         <w:r>
           <w:rPr>
@@ -384,7 +384,7 @@
           <w14:ligatures w14:val="standardContextual"/>
         </w:rPr>
       </w:pPr>
-      <w:hyperlink w:anchor="_Toc243297011" w:history="1">
+      <w:hyperlink w:anchor="_Toc243297573" w:history="1">
         <w:r>
           <w:rPr>
             <w:rStyle w:val="aff9"/>
@@ -430,7 +430,7 @@
             <w:noProof/>
             <w:webHidden/>
           </w:rPr>
-          <w:instrText>PAGEREF _Toc243297011 \h</w:instrText>
+          <w:instrText>PAGEREF _Toc243297573 \h</w:instrText>
         </w:r>
         <w:r>
           <w:rPr>
@@ -461,110 +461,6 @@
             <w:webHidden/>
           </w:rPr>
           <w:t>3</w:t>
-        </w:r>
-        <w:r>
-          <w:rPr>
-            <w:rFonts w:hint="eastAsia"/>
-            <w:noProof/>
-            <w:webHidden/>
-          </w:rPr>
-          <w:fldChar w:fldCharType="end"/>
-        </w:r>
-      </w:hyperlink>
-    </w:p>
-    <w:p>
-      <w:pPr>
-        <w:pStyle w:val="TOC1"/>
-        <w:tabs>
-          <w:tab w:val="right" w:leader="dot" w:pos="9402"/>
-        </w:tabs>
-        <w:rPr>
-          <w:rFonts w:asciiTheme="minorHAnsi" w:eastAsiaTheme="minorEastAsia" w:hAnsiTheme="minorHAnsi" w:hint="eastAsia"/>
-          <w:noProof/>
-          <w:kern w:val="2"/>
-          <w:sz w:val="22"/>
-          <w:szCs w:val="24"/>
-          <w:lang w:eastAsia="zh-CN"/>
-          <w14:ligatures w14:val="standardContextual"/>
-        </w:rPr>
-      </w:pPr>
-      <w:hyperlink w:anchor="_Toc243297012" w:history="1">
-        <w:r>
-          <w:rPr>
-            <w:rStyle w:val="aff9"/>
-            <w:rFonts w:eastAsia="黑体"/>
-            <w:noProof/>
-          </w:rPr>
-          <w:t>3. Q1</w:t>
-        </w:r>
-        <w:r>
-          <w:rPr>
-            <w:rStyle w:val="aff9"/>
-            <w:rFonts w:eastAsia="黑体"/>
-            <w:noProof/>
-          </w:rPr>
-          <w:t>：公告日收益与成交量</w:t>
-        </w:r>
-        <w:r>
-          <w:rPr>
-            <w:rFonts w:hint="eastAsia"/>
-            <w:noProof/>
-            <w:webHidden/>
-          </w:rPr>
-          <w:tab/>
-        </w:r>
-        <w:r>
-          <w:rPr>
-            <w:rFonts w:hint="eastAsia"/>
-            <w:noProof/>
-            <w:webHidden/>
-          </w:rPr>
-          <w:fldChar w:fldCharType="begin"/>
-        </w:r>
-        <w:r>
-          <w:rPr>
-            <w:rFonts w:hint="eastAsia"/>
-            <w:noProof/>
-            <w:webHidden/>
-          </w:rPr>
-          <w:instrText xml:space="preserve"> </w:instrText>
-        </w:r>
-        <w:r>
-          <w:rPr>
-            <w:noProof/>
-            <w:webHidden/>
-          </w:rPr>
-          <w:instrText>PAGEREF _Toc243297012 \h</w:instrText>
-        </w:r>
-        <w:r>
-          <w:rPr>
-            <w:rFonts w:hint="eastAsia"/>
-            <w:noProof/>
-            <w:webHidden/>
-          </w:rPr>
-          <w:instrText xml:space="preserve"> </w:instrText>
-        </w:r>
-        <w:r>
-          <w:rPr>
-            <w:rFonts w:hint="eastAsia"/>
-            <w:noProof/>
-            <w:webHidden/>
-          </w:rPr>
-        </w:r>
-        <w:r>
-          <w:rPr>
-            <w:rFonts w:hint="eastAsia"/>
-            <w:noProof/>
-            <w:webHidden/>
-          </w:rPr>
-          <w:fldChar w:fldCharType="separate"/>
-        </w:r>
-        <w:r>
-          <w:rPr>
-            <w:noProof/>
-            <w:webHidden/>
-          </w:rPr>
-          <w:t>4</w:t>
         </w:r>
         <w:r>
           <w:rPr>
@@ -593,14 +489,14 @@
           <w14:ligatures w14:val="standardContextual"/>
         </w:rPr>
       </w:pPr>
-      <w:hyperlink w:anchor="_Toc243297013" w:history="1">
+      <w:hyperlink w:anchor="_Toc243297574" w:history="1">
         <w:r>
           <w:rPr>
             <w:rStyle w:val="aff9"/>
             <w:rFonts w:eastAsia="黑体"/>
             <w:noProof/>
           </w:rPr>
-          <w:t xml:space="preserve">3.1 </w:t>
+          <w:t xml:space="preserve">2.1 </w:t>
         </w:r>
         <w:r>
           <w:rPr>
@@ -608,7 +504,7 @@
             <w:rFonts w:eastAsia="黑体"/>
             <w:noProof/>
           </w:rPr>
-          <w:t>问题原文</w:t>
+          <w:t>三个层次</w:t>
         </w:r>
         <w:r>
           <w:rPr>
@@ -639,7 +535,111 @@
             <w:noProof/>
             <w:webHidden/>
           </w:rPr>
-          <w:instrText>PAGEREF _Toc243297013 \h</w:instrText>
+          <w:instrText>PAGEREF _Toc243297574 \h</w:instrText>
+        </w:r>
+        <w:r>
+          <w:rPr>
+            <w:rFonts w:hint="eastAsia"/>
+            <w:noProof/>
+            <w:webHidden/>
+          </w:rPr>
+          <w:instrText xml:space="preserve"> </w:instrText>
+        </w:r>
+        <w:r>
+          <w:rPr>
+            <w:rFonts w:hint="eastAsia"/>
+            <w:noProof/>
+            <w:webHidden/>
+          </w:rPr>
+        </w:r>
+        <w:r>
+          <w:rPr>
+            <w:rFonts w:hint="eastAsia"/>
+            <w:noProof/>
+            <w:webHidden/>
+          </w:rPr>
+          <w:fldChar w:fldCharType="separate"/>
+        </w:r>
+        <w:r>
+          <w:rPr>
+            <w:noProof/>
+            <w:webHidden/>
+          </w:rPr>
+          <w:t>4</w:t>
+        </w:r>
+        <w:r>
+          <w:rPr>
+            <w:rFonts w:hint="eastAsia"/>
+            <w:noProof/>
+            <w:webHidden/>
+          </w:rPr>
+          <w:fldChar w:fldCharType="end"/>
+        </w:r>
+      </w:hyperlink>
+    </w:p>
+    <w:p>
+      <w:pPr>
+        <w:pStyle w:val="TOC1"/>
+        <w:tabs>
+          <w:tab w:val="right" w:leader="dot" w:pos="9402"/>
+        </w:tabs>
+        <w:rPr>
+          <w:rFonts w:asciiTheme="minorHAnsi" w:eastAsiaTheme="minorEastAsia" w:hAnsiTheme="minorHAnsi" w:hint="eastAsia"/>
+          <w:noProof/>
+          <w:kern w:val="2"/>
+          <w:sz w:val="22"/>
+          <w:szCs w:val="24"/>
+          <w:lang w:eastAsia="zh-CN"/>
+          <w14:ligatures w14:val="standardContextual"/>
+        </w:rPr>
+      </w:pPr>
+      <w:hyperlink w:anchor="_Toc243297575" w:history="1">
+        <w:r>
+          <w:rPr>
+            <w:rStyle w:val="aff9"/>
+            <w:rFonts w:eastAsia="黑体"/>
+            <w:noProof/>
+          </w:rPr>
+          <w:t>3. Q1</w:t>
+        </w:r>
+        <w:r>
+          <w:rPr>
+            <w:rStyle w:val="aff9"/>
+            <w:rFonts w:eastAsia="黑体"/>
+            <w:noProof/>
+          </w:rPr>
+          <w:t>：公告日收益与成交量</w:t>
+        </w:r>
+        <w:r>
+          <w:rPr>
+            <w:rFonts w:hint="eastAsia"/>
+            <w:noProof/>
+            <w:webHidden/>
+          </w:rPr>
+          <w:tab/>
+        </w:r>
+        <w:r>
+          <w:rPr>
+            <w:rFonts w:hint="eastAsia"/>
+            <w:noProof/>
+            <w:webHidden/>
+          </w:rPr>
+          <w:fldChar w:fldCharType="begin"/>
+        </w:r>
+        <w:r>
+          <w:rPr>
+            <w:rFonts w:hint="eastAsia"/>
+            <w:noProof/>
+            <w:webHidden/>
+          </w:rPr>
+          <w:instrText xml:space="preserve"> </w:instrText>
+        </w:r>
+        <w:r>
+          <w:rPr>
+            <w:noProof/>
+            <w:webHidden/>
+          </w:rPr>
+          <w:instrText>PAGEREF _Toc243297575 \h</w:instrText>
         </w:r>
         <w:r>
           <w:rPr>
@@ -698,14 +698,14 @@
           <w14:ligatures w14:val="standardContextual"/>
         </w:rPr>
       </w:pPr>
-      <w:hyperlink w:anchor="_Toc243297014" w:history="1">
+      <w:hyperlink w:anchor="_Toc243297576" w:history="1">
         <w:r>
           <w:rPr>
             <w:rStyle w:val="aff9"/>
             <w:rFonts w:eastAsia="黑体"/>
             <w:noProof/>
           </w:rPr>
-          <w:t xml:space="preserve">3.2 </w:t>
+          <w:t xml:space="preserve">3.1 </w:t>
         </w:r>
         <w:r>
           <w:rPr>
@@ -713,7 +713,7 @@
             <w:rFonts w:eastAsia="黑体"/>
             <w:noProof/>
           </w:rPr>
-          <w:t>问题真正问什么</w:t>
+          <w:t>问题原文</w:t>
         </w:r>
         <w:r>
           <w:rPr>
@@ -744,7 +744,7 @@
             <w:noProof/>
             <w:webHidden/>
           </w:rPr>
-          <w:instrText>PAGEREF _Toc243297014 \h</w:instrText>
+          <w:instrText>PAGEREF _Toc243297576 \h</w:instrText>
         </w:r>
         <w:r>
           <w:rPr>
@@ -803,14 +803,14 @@
           <w14:ligatures w14:val="standardContextual"/>
         </w:rPr>
       </w:pPr>
-      <w:hyperlink w:anchor="_Toc243297015" w:history="1">
+      <w:hyperlink w:anchor="_Toc243297577" w:history="1">
         <w:r>
           <w:rPr>
             <w:rStyle w:val="aff9"/>
             <w:rFonts w:eastAsia="黑体"/>
             <w:noProof/>
           </w:rPr>
-          <w:t xml:space="preserve">3.3 </w:t>
+          <w:t xml:space="preserve">3.2 </w:t>
         </w:r>
         <w:r>
           <w:rPr>
@@ -818,7 +818,7 @@
             <w:rFonts w:eastAsia="黑体"/>
             <w:noProof/>
           </w:rPr>
-          <w:t>我们的回答</w:t>
+          <w:t>问题真正问什么</w:t>
         </w:r>
         <w:r>
           <w:rPr>
@@ -849,7 +849,7 @@
             <w:noProof/>
             <w:webHidden/>
           </w:rPr>
-          <w:instrText>PAGEREF _Toc243297015 \h</w:instrText>
+          <w:instrText>PAGEREF _Toc243297577 \h</w:instrText>
         </w:r>
         <w:r>
           <w:rPr>
@@ -908,14 +908,14 @@
           <w14:ligatures w14:val="standardContextual"/>
         </w:rPr>
       </w:pPr>
-      <w:hyperlink w:anchor="_Toc243297016" w:history="1">
+      <w:hyperlink w:anchor="_Toc243297578" w:history="1">
         <w:r>
           <w:rPr>
             <w:rStyle w:val="aff9"/>
             <w:rFonts w:eastAsia="黑体"/>
             <w:noProof/>
           </w:rPr>
-          <w:t xml:space="preserve">3.4 </w:t>
+          <w:t xml:space="preserve">3.3 </w:t>
         </w:r>
         <w:r>
           <w:rPr>
@@ -923,7 +923,7 @@
             <w:rFonts w:eastAsia="黑体"/>
             <w:noProof/>
           </w:rPr>
-          <w:t>四个格子</w:t>
+          <w:t>我们的回答</w:t>
         </w:r>
         <w:r>
           <w:rPr>
@@ -954,7 +954,7 @@
             <w:noProof/>
             <w:webHidden/>
           </w:rPr>
-          <w:instrText>PAGEREF _Toc243297016 \h</w:instrText>
+          <w:instrText>PAGEREF _Toc243297578 \h</w:instrText>
         </w:r>
         <w:r>
           <w:rPr>
@@ -1013,14 +1013,14 @@
           <w14:ligatures w14:val="standardContextual"/>
         </w:rPr>
       </w:pPr>
-      <w:hyperlink w:anchor="_Toc243297017" w:history="1">
+      <w:hyperlink w:anchor="_Toc243297579" w:history="1">
         <w:r>
           <w:rPr>
             <w:rStyle w:val="aff9"/>
             <w:rFonts w:eastAsia="黑体"/>
             <w:noProof/>
           </w:rPr>
-          <w:t xml:space="preserve">3.5 </w:t>
+          <w:t xml:space="preserve">3.4 </w:t>
         </w:r>
         <w:r>
           <w:rPr>
@@ -1028,7 +1028,7 @@
             <w:rFonts w:eastAsia="黑体"/>
             <w:noProof/>
           </w:rPr>
-          <w:t>底层逻辑</w:t>
+          <w:t>四个格子</w:t>
         </w:r>
         <w:r>
           <w:rPr>
@@ -1059,7 +1059,7 @@
             <w:noProof/>
             <w:webHidden/>
           </w:rPr>
-          <w:instrText>PAGEREF _Toc243297017 \h</w:instrText>
+          <w:instrText>PAGEREF _Toc243297579 \h</w:instrText>
         </w:r>
         <w:r>
           <w:rPr>
@@ -1089,7 +1089,7 @@
             <w:noProof/>
             <w:webHidden/>
           </w:rPr>
-          <w:t>5</w:t>
+          <w:t>4</w:t>
         </w:r>
         <w:r>
           <w:rPr>
@@ -1118,14 +1118,14 @@
           <w14:ligatures w14:val="standardContextual"/>
         </w:rPr>
       </w:pPr>
-      <w:hyperlink w:anchor="_Toc243297018" w:history="1">
+      <w:hyperlink w:anchor="_Toc243297580" w:history="1">
         <w:r>
           <w:rPr>
             <w:rStyle w:val="aff9"/>
             <w:rFonts w:eastAsia="黑体"/>
             <w:noProof/>
           </w:rPr>
-          <w:t xml:space="preserve">3.6 </w:t>
+          <w:t xml:space="preserve">3.5 </w:t>
         </w:r>
         <w:r>
           <w:rPr>
@@ -1133,7 +1133,7 @@
             <w:rFonts w:eastAsia="黑体"/>
             <w:noProof/>
           </w:rPr>
-          <w:t>口播</w:t>
+          <w:t>底层逻辑</w:t>
         </w:r>
         <w:r>
           <w:rPr>
@@ -1164,7 +1164,7 @@
             <w:noProof/>
             <w:webHidden/>
           </w:rPr>
-          <w:instrText>PAGEREF _Toc243297018 \h</w:instrText>
+          <w:instrText>PAGEREF _Toc243297580 \h</w:instrText>
         </w:r>
         <w:r>
           <w:rPr>
@@ -1223,14 +1223,14 @@
           <w14:ligatures w14:val="standardContextual"/>
         </w:rPr>
       </w:pPr>
-      <w:hyperlink w:anchor="_Toc243297019" w:history="1">
+      <w:hyperlink w:anchor="_Toc243297581" w:history="1">
         <w:r>
           <w:rPr>
             <w:rStyle w:val="aff9"/>
             <w:rFonts w:eastAsia="黑体"/>
             <w:noProof/>
           </w:rPr>
-          <w:t xml:space="preserve">3.7 </w:t>
+          <w:t xml:space="preserve">3.6 </w:t>
         </w:r>
         <w:r>
           <w:rPr>
@@ -1238,7 +1238,7 @@
             <w:rFonts w:eastAsia="黑体"/>
             <w:noProof/>
           </w:rPr>
-          <w:t>不能说的话</w:t>
+          <w:t>口播</w:t>
         </w:r>
         <w:r>
           <w:rPr>
@@ -1269,111 +1269,7 @@
             <w:noProof/>
             <w:webHidden/>
           </w:rPr>
-          <w:instrText>PAGEREF _Toc243297019 \h</w:instrText>
-        </w:r>
-        <w:r>
-          <w:rPr>
-            <w:rFonts w:hint="eastAsia"/>
-            <w:noProof/>
-            <w:webHidden/>
-          </w:rPr>
-          <w:instrText xml:space="preserve"> </w:instrText>
-        </w:r>
-        <w:r>
-          <w:rPr>
-            <w:rFonts w:hint="eastAsia"/>
-            <w:noProof/>
-            <w:webHidden/>
-          </w:rPr>
-        </w:r>
-        <w:r>
-          <w:rPr>
-            <w:rFonts w:hint="eastAsia"/>
-            <w:noProof/>
-            <w:webHidden/>
-          </w:rPr>
-          <w:fldChar w:fldCharType="separate"/>
-        </w:r>
-        <w:r>
-          <w:rPr>
-            <w:noProof/>
-            <w:webHidden/>
-          </w:rPr>
-          <w:t>5</w:t>
-        </w:r>
-        <w:r>
-          <w:rPr>
-            <w:rFonts w:hint="eastAsia"/>
-            <w:noProof/>
-            <w:webHidden/>
-          </w:rPr>
-          <w:fldChar w:fldCharType="end"/>
-        </w:r>
-      </w:hyperlink>
-    </w:p>
-    <w:p>
-      <w:pPr>
-        <w:pStyle w:val="TOC1"/>
-        <w:tabs>
-          <w:tab w:val="right" w:leader="dot" w:pos="9402"/>
-        </w:tabs>
-        <w:rPr>
-          <w:rFonts w:asciiTheme="minorHAnsi" w:eastAsiaTheme="minorEastAsia" w:hAnsiTheme="minorHAnsi" w:hint="eastAsia"/>
-          <w:noProof/>
-          <w:kern w:val="2"/>
-          <w:sz w:val="22"/>
-          <w:szCs w:val="24"/>
-          <w:lang w:eastAsia="zh-CN"/>
-          <w14:ligatures w14:val="standardContextual"/>
-        </w:rPr>
-      </w:pPr>
-      <w:hyperlink w:anchor="_Toc243297020" w:history="1">
-        <w:r>
-          <w:rPr>
-            <w:rStyle w:val="aff9"/>
-            <w:rFonts w:eastAsia="黑体"/>
-            <w:noProof/>
-          </w:rPr>
-          <w:t>4. Q2</w:t>
-        </w:r>
-        <w:r>
-          <w:rPr>
-            <w:rStyle w:val="aff9"/>
-            <w:rFonts w:eastAsia="黑体"/>
-            <w:noProof/>
-          </w:rPr>
-          <w:t>：公告后漂移与反转</w:t>
-        </w:r>
-        <w:r>
-          <w:rPr>
-            <w:rFonts w:hint="eastAsia"/>
-            <w:noProof/>
-            <w:webHidden/>
-          </w:rPr>
-          <w:tab/>
-        </w:r>
-        <w:r>
-          <w:rPr>
-            <w:rFonts w:hint="eastAsia"/>
-            <w:noProof/>
-            <w:webHidden/>
-          </w:rPr>
-          <w:fldChar w:fldCharType="begin"/>
-        </w:r>
-        <w:r>
-          <w:rPr>
-            <w:rFonts w:hint="eastAsia"/>
-            <w:noProof/>
-            <w:webHidden/>
-          </w:rPr>
-          <w:instrText xml:space="preserve"> </w:instrText>
-        </w:r>
-        <w:r>
-          <w:rPr>
-            <w:noProof/>
-            <w:webHidden/>
-          </w:rPr>
-          <w:instrText>PAGEREF _Toc243297020 \h</w:instrText>
+          <w:instrText>PAGEREF _Toc243297581 \h</w:instrText>
         </w:r>
         <w:r>
           <w:rPr>
@@ -1432,14 +1328,14 @@
           <w14:ligatures w14:val="standardContextual"/>
         </w:rPr>
       </w:pPr>
-      <w:hyperlink w:anchor="_Toc243297021" w:history="1">
+      <w:hyperlink w:anchor="_Toc243297582" w:history="1">
         <w:r>
           <w:rPr>
             <w:rStyle w:val="aff9"/>
             <w:rFonts w:eastAsia="黑体"/>
             <w:noProof/>
           </w:rPr>
-          <w:t xml:space="preserve">4.1 </w:t>
+          <w:t xml:space="preserve">3.7 </w:t>
         </w:r>
         <w:r>
           <w:rPr>
@@ -1447,7 +1343,7 @@
             <w:rFonts w:eastAsia="黑体"/>
             <w:noProof/>
           </w:rPr>
-          <w:t>问题原文</w:t>
+          <w:t>不能说的话</w:t>
         </w:r>
         <w:r>
           <w:rPr>
@@ -1478,7 +1374,7 @@
             <w:noProof/>
             <w:webHidden/>
           </w:rPr>
-          <w:instrText>PAGEREF _Toc243297021 \h</w:instrText>
+          <w:instrText>PAGEREF _Toc243297582 \h</w:instrText>
         </w:r>
         <w:r>
           <w:rPr>
@@ -1508,7 +1404,111 @@
             <w:noProof/>
             <w:webHidden/>
           </w:rPr>
-          <w:t>5</w:t>
+          <w:t>6</w:t>
+        </w:r>
+        <w:r>
+          <w:rPr>
+            <w:rFonts w:hint="eastAsia"/>
+            <w:noProof/>
+            <w:webHidden/>
+          </w:rPr>
+          <w:fldChar w:fldCharType="end"/>
+        </w:r>
+      </w:hyperlink>
+    </w:p>
+    <w:p>
+      <w:pPr>
+        <w:pStyle w:val="TOC1"/>
+        <w:tabs>
+          <w:tab w:val="right" w:leader="dot" w:pos="9402"/>
+        </w:tabs>
+        <w:rPr>
+          <w:rFonts w:asciiTheme="minorHAnsi" w:eastAsiaTheme="minorEastAsia" w:hAnsiTheme="minorHAnsi" w:hint="eastAsia"/>
+          <w:noProof/>
+          <w:kern w:val="2"/>
+          <w:sz w:val="22"/>
+          <w:szCs w:val="24"/>
+          <w:lang w:eastAsia="zh-CN"/>
+          <w14:ligatures w14:val="standardContextual"/>
+        </w:rPr>
+      </w:pPr>
+      <w:hyperlink w:anchor="_Toc243297583" w:history="1">
+        <w:r>
+          <w:rPr>
+            <w:rStyle w:val="aff9"/>
+            <w:rFonts w:eastAsia="黑体"/>
+            <w:noProof/>
+          </w:rPr>
+          <w:t>4. Q2</w:t>
+        </w:r>
+        <w:r>
+          <w:rPr>
+            <w:rStyle w:val="aff9"/>
+            <w:rFonts w:eastAsia="黑体"/>
+            <w:noProof/>
+          </w:rPr>
+          <w:t>：公告后漂移与反转</w:t>
+        </w:r>
+        <w:r>
+          <w:rPr>
+            <w:rFonts w:hint="eastAsia"/>
+            <w:noProof/>
+            <w:webHidden/>
+          </w:rPr>
+          <w:tab/>
+        </w:r>
+        <w:r>
+          <w:rPr>
+            <w:rFonts w:hint="eastAsia"/>
+            <w:noProof/>
+            <w:webHidden/>
+          </w:rPr>
+          <w:fldChar w:fldCharType="begin"/>
+        </w:r>
+        <w:r>
+          <w:rPr>
+            <w:rFonts w:hint="eastAsia"/>
+            <w:noProof/>
+            <w:webHidden/>
+          </w:rPr>
+          <w:instrText xml:space="preserve"> </w:instrText>
+        </w:r>
+        <w:r>
+          <w:rPr>
+            <w:noProof/>
+            <w:webHidden/>
+          </w:rPr>
+          <w:instrText>PAGEREF _Toc243297583 \h</w:instrText>
+        </w:r>
+        <w:r>
+          <w:rPr>
+            <w:rFonts w:hint="eastAsia"/>
+            <w:noProof/>
+            <w:webHidden/>
+          </w:rPr>
+          <w:instrText xml:space="preserve"> </w:instrText>
+        </w:r>
+        <w:r>
+          <w:rPr>
+            <w:rFonts w:hint="eastAsia"/>
+            <w:noProof/>
+            <w:webHidden/>
+          </w:rPr>
+        </w:r>
+        <w:r>
+          <w:rPr>
+            <w:rFonts w:hint="eastAsia"/>
+            <w:noProof/>
+            <w:webHidden/>
+          </w:rPr>
+          <w:fldChar w:fldCharType="separate"/>
+        </w:r>
+        <w:r>
+          <w:rPr>
+            <w:noProof/>
+            <w:webHidden/>
+          </w:rPr>
+          <w:t>6</w:t>
         </w:r>
         <w:r>
           <w:rPr>
@@ -1537,14 +1537,14 @@
           <w14:ligatures w14:val="standardContextual"/>
         </w:rPr>
       </w:pPr>
-      <w:hyperlink w:anchor="_Toc243297022" w:history="1">
+      <w:hyperlink w:anchor="_Toc243297584" w:history="1">
         <w:r>
           <w:rPr>
             <w:rStyle w:val="aff9"/>
             <w:rFonts w:eastAsia="黑体"/>
             <w:noProof/>
           </w:rPr>
-          <w:t xml:space="preserve">4.2 </w:t>
+          <w:t xml:space="preserve">4.1 </w:t>
         </w:r>
         <w:r>
           <w:rPr>
@@ -1552,7 +1552,7 @@
             <w:rFonts w:eastAsia="黑体"/>
             <w:noProof/>
           </w:rPr>
-          <w:t>问题真正问什么</w:t>
+          <w:t>问题原文</w:t>
         </w:r>
         <w:r>
           <w:rPr>
@@ -1583,7 +1583,7 @@
             <w:noProof/>
             <w:webHidden/>
           </w:rPr>
-          <w:instrText>PAGEREF _Toc243297022 \h</w:instrText>
+          <w:instrText>PAGEREF _Toc243297584 \h</w:instrText>
         </w:r>
         <w:r>
           <w:rPr>
@@ -1642,14 +1642,14 @@
           <w14:ligatures w14:val="standardContextual"/>
         </w:rPr>
       </w:pPr>
-      <w:hyperlink w:anchor="_Toc243297023" w:history="1">
+      <w:hyperlink w:anchor="_Toc243297585" w:history="1">
         <w:r>
           <w:rPr>
             <w:rStyle w:val="aff9"/>
             <w:rFonts w:eastAsia="黑体"/>
             <w:noProof/>
           </w:rPr>
-          <w:t xml:space="preserve">4.3 </w:t>
+          <w:t xml:space="preserve">4.2 </w:t>
         </w:r>
         <w:r>
           <w:rPr>
@@ -1657,7 +1657,7 @@
             <w:rFonts w:eastAsia="黑体"/>
             <w:noProof/>
           </w:rPr>
-          <w:t>我们的回答</w:t>
+          <w:t>问题真正问什么</w:t>
         </w:r>
         <w:r>
           <w:rPr>
@@ -1688,7 +1688,7 @@
             <w:noProof/>
             <w:webHidden/>
           </w:rPr>
-          <w:instrText>PAGEREF _Toc243297023 \h</w:instrText>
+          <w:instrText>PAGEREF _Toc243297585 \h</w:instrText>
         </w:r>
         <w:r>
           <w:rPr>
@@ -1747,14 +1747,14 @@
           <w14:ligatures w14:val="standardContextual"/>
         </w:rPr>
       </w:pPr>
-      <w:hyperlink w:anchor="_Toc243297024" w:history="1">
+      <w:hyperlink w:anchor="_Toc243297586" w:history="1">
         <w:r>
           <w:rPr>
             <w:rStyle w:val="aff9"/>
             <w:rFonts w:eastAsia="黑体"/>
             <w:noProof/>
           </w:rPr>
-          <w:t xml:space="preserve">4.4 </w:t>
+          <w:t xml:space="preserve">4.3 </w:t>
         </w:r>
         <w:r>
           <w:rPr>
@@ -1762,7 +1762,7 @@
             <w:rFonts w:eastAsia="黑体"/>
             <w:noProof/>
           </w:rPr>
-          <w:t>数字</w:t>
+          <w:t>我们的回答</w:t>
         </w:r>
         <w:r>
           <w:rPr>
@@ -1793,7 +1793,7 @@
             <w:noProof/>
             <w:webHidden/>
           </w:rPr>
-          <w:instrText>PAGEREF _Toc243297024 \h</w:instrText>
+          <w:instrText>PAGEREF _Toc243297586 \h</w:instrText>
         </w:r>
         <w:r>
           <w:rPr>
@@ -1852,14 +1852,14 @@
           <w14:ligatures w14:val="standardContextual"/>
         </w:rPr>
       </w:pPr>
-      <w:hyperlink w:anchor="_Toc243297025" w:history="1">
+      <w:hyperlink w:anchor="_Toc243297587" w:history="1">
         <w:r>
           <w:rPr>
             <w:rStyle w:val="aff9"/>
             <w:rFonts w:eastAsia="黑体"/>
             <w:noProof/>
           </w:rPr>
-          <w:t xml:space="preserve">4.5 </w:t>
+          <w:t xml:space="preserve">4.4 </w:t>
         </w:r>
         <w:r>
           <w:rPr>
@@ -1867,7 +1867,7 @@
             <w:rFonts w:eastAsia="黑体"/>
             <w:noProof/>
           </w:rPr>
-          <w:t>底层逻辑</w:t>
+          <w:t>数字</w:t>
         </w:r>
         <w:r>
           <w:rPr>
@@ -1898,7 +1898,7 @@
             <w:noProof/>
             <w:webHidden/>
           </w:rPr>
-          <w:instrText>PAGEREF _Toc243297025 \h</w:instrText>
+          <w:instrText>PAGEREF _Toc243297587 \h</w:instrText>
         </w:r>
         <w:r>
           <w:rPr>
@@ -1957,14 +1957,14 @@
           <w14:ligatures w14:val="standardContextual"/>
         </w:rPr>
       </w:pPr>
-      <w:hyperlink w:anchor="_Toc243297026" w:history="1">
+      <w:hyperlink w:anchor="_Toc243297588" w:history="1">
         <w:r>
           <w:rPr>
             <w:rStyle w:val="aff9"/>
             <w:rFonts w:eastAsia="黑体"/>
             <w:noProof/>
           </w:rPr>
-          <w:t xml:space="preserve">4.6 </w:t>
+          <w:t xml:space="preserve">4.5 </w:t>
         </w:r>
         <w:r>
           <w:rPr>
@@ -1972,7 +1972,7 @@
             <w:rFonts w:eastAsia="黑体"/>
             <w:noProof/>
           </w:rPr>
-          <w:t>口播</w:t>
+          <w:t>底层逻辑</w:t>
         </w:r>
         <w:r>
           <w:rPr>
@@ -2003,7 +2003,7 @@
             <w:noProof/>
             <w:webHidden/>
           </w:rPr>
-          <w:instrText>PAGEREF _Toc243297026 \h</w:instrText>
+          <w:instrText>PAGEREF _Toc243297588 \h</w:instrText>
         </w:r>
         <w:r>
           <w:rPr>
@@ -2033,7 +2033,7 @@
             <w:noProof/>
             <w:webHidden/>
           </w:rPr>
-          <w:t>7</w:t>
+          <w:t>6</w:t>
         </w:r>
         <w:r>
           <w:rPr>
@@ -2062,14 +2062,14 @@
           <w14:ligatures w14:val="standardContextual"/>
         </w:rPr>
       </w:pPr>
-      <w:hyperlink w:anchor="_Toc243297027" w:history="1">
+      <w:hyperlink w:anchor="_Toc243297589" w:history="1">
         <w:r>
           <w:rPr>
             <w:rStyle w:val="aff9"/>
             <w:rFonts w:eastAsia="黑体"/>
             <w:noProof/>
           </w:rPr>
-          <w:t xml:space="preserve">4.7 </w:t>
+          <w:t xml:space="preserve">4.6 </w:t>
         </w:r>
         <w:r>
           <w:rPr>
@@ -2077,7 +2077,7 @@
             <w:rFonts w:eastAsia="黑体"/>
             <w:noProof/>
           </w:rPr>
-          <w:t>不能说的话</w:t>
+          <w:t>口播</w:t>
         </w:r>
         <w:r>
           <w:rPr>
@@ -2108,111 +2108,7 @@
             <w:noProof/>
             <w:webHidden/>
           </w:rPr>
-          <w:instrText>PAGEREF _Toc243297027 \h</w:instrText>
-        </w:r>
-        <w:r>
-          <w:rPr>
-            <w:rFonts w:hint="eastAsia"/>
-            <w:noProof/>
-            <w:webHidden/>
-          </w:rPr>
-          <w:instrText xml:space="preserve"> </w:instrText>
-        </w:r>
-        <w:r>
-          <w:rPr>
-            <w:rFonts w:hint="eastAsia"/>
-            <w:noProof/>
-            <w:webHidden/>
-          </w:rPr>
-        </w:r>
-        <w:r>
-          <w:rPr>
-            <w:rFonts w:hint="eastAsia"/>
-            <w:noProof/>
-            <w:webHidden/>
-          </w:rPr>
-          <w:fldChar w:fldCharType="separate"/>
-        </w:r>
-        <w:r>
-          <w:rPr>
-            <w:noProof/>
-            <w:webHidden/>
-          </w:rPr>
-          <w:t>7</w:t>
-        </w:r>
-        <w:r>
-          <w:rPr>
-            <w:rFonts w:hint="eastAsia"/>
-            <w:noProof/>
-            <w:webHidden/>
-          </w:rPr>
-          <w:fldChar w:fldCharType="end"/>
-        </w:r>
-      </w:hyperlink>
-    </w:p>
-    <w:p>
-      <w:pPr>
-        <w:pStyle w:val="TOC1"/>
-        <w:tabs>
-          <w:tab w:val="right" w:leader="dot" w:pos="9402"/>
-        </w:tabs>
-        <w:rPr>
-          <w:rFonts w:asciiTheme="minorHAnsi" w:eastAsiaTheme="minorEastAsia" w:hAnsiTheme="minorHAnsi" w:hint="eastAsia"/>
-          <w:noProof/>
-          <w:kern w:val="2"/>
-          <w:sz w:val="22"/>
-          <w:szCs w:val="24"/>
-          <w:lang w:eastAsia="zh-CN"/>
-          <w14:ligatures w14:val="standardContextual"/>
-        </w:rPr>
-      </w:pPr>
-      <w:hyperlink w:anchor="_Toc243297028" w:history="1">
-        <w:r>
-          <w:rPr>
-            <w:rStyle w:val="aff9"/>
-            <w:rFonts w:eastAsia="黑体"/>
-            <w:noProof/>
-          </w:rPr>
-          <w:t>5. Q3</w:t>
-        </w:r>
-        <w:r>
-          <w:rPr>
-            <w:rStyle w:val="aff9"/>
-            <w:rFonts w:eastAsia="黑体"/>
-            <w:noProof/>
-          </w:rPr>
-          <w:t>：更准，还是只是影响市场</w:t>
-        </w:r>
-        <w:r>
-          <w:rPr>
-            <w:rFonts w:hint="eastAsia"/>
-            <w:noProof/>
-            <w:webHidden/>
-          </w:rPr>
-          <w:tab/>
-        </w:r>
-        <w:r>
-          <w:rPr>
-            <w:rFonts w:hint="eastAsia"/>
-            <w:noProof/>
-            <w:webHidden/>
-          </w:rPr>
-          <w:fldChar w:fldCharType="begin"/>
-        </w:r>
-        <w:r>
-          <w:rPr>
-            <w:rFonts w:hint="eastAsia"/>
-            <w:noProof/>
-            <w:webHidden/>
-          </w:rPr>
-          <w:instrText xml:space="preserve"> </w:instrText>
-        </w:r>
-        <w:r>
-          <w:rPr>
-            <w:noProof/>
-            <w:webHidden/>
-          </w:rPr>
-          <w:instrText>PAGEREF _Toc243297028 \h</w:instrText>
+          <w:instrText>PAGEREF _Toc243297589 \h</w:instrText>
         </w:r>
         <w:r>
           <w:rPr>
@@ -2271,14 +2167,14 @@
           <w14:ligatures w14:val="standardContextual"/>
         </w:rPr>
       </w:pPr>
-      <w:hyperlink w:anchor="_Toc243297029" w:history="1">
+      <w:hyperlink w:anchor="_Toc243297590" w:history="1">
         <w:r>
           <w:rPr>
             <w:rStyle w:val="aff9"/>
             <w:rFonts w:eastAsia="黑体"/>
             <w:noProof/>
           </w:rPr>
-          <w:t xml:space="preserve">5.1 </w:t>
+          <w:t xml:space="preserve">4.7 </w:t>
         </w:r>
         <w:r>
           <w:rPr>
@@ -2286,7 +2182,7 @@
             <w:rFonts w:eastAsia="黑体"/>
             <w:noProof/>
           </w:rPr>
-          <w:t>问题原文</w:t>
+          <w:t>不能说的话</w:t>
         </w:r>
         <w:r>
           <w:rPr>
@@ -2317,7 +2213,111 @@
             <w:noProof/>
             <w:webHidden/>
           </w:rPr>
-          <w:instrText>PAGEREF _Toc243297029 \h</w:instrText>
+          <w:instrText>PAGEREF _Toc243297590 \h</w:instrText>
+        </w:r>
+        <w:r>
+          <w:rPr>
+            <w:rFonts w:hint="eastAsia"/>
+            <w:noProof/>
+            <w:webHidden/>
+          </w:rPr>
+          <w:instrText xml:space="preserve"> </w:instrText>
+        </w:r>
+        <w:r>
+          <w:rPr>
+            <w:rFonts w:hint="eastAsia"/>
+            <w:noProof/>
+            <w:webHidden/>
+          </w:rPr>
+        </w:r>
+        <w:r>
+          <w:rPr>
+            <w:rFonts w:hint="eastAsia"/>
+            <w:noProof/>
+            <w:webHidden/>
+          </w:rPr>
+          <w:fldChar w:fldCharType="separate"/>
+        </w:r>
+        <w:r>
+          <w:rPr>
+            <w:noProof/>
+            <w:webHidden/>
+          </w:rPr>
+          <w:t>7</w:t>
+        </w:r>
+        <w:r>
+          <w:rPr>
+            <w:rFonts w:hint="eastAsia"/>
+            <w:noProof/>
+            <w:webHidden/>
+          </w:rPr>
+          <w:fldChar w:fldCharType="end"/>
+        </w:r>
+      </w:hyperlink>
+    </w:p>
+    <w:p>
+      <w:pPr>
+        <w:pStyle w:val="TOC1"/>
+        <w:tabs>
+          <w:tab w:val="right" w:leader="dot" w:pos="9402"/>
+        </w:tabs>
+        <w:rPr>
+          <w:rFonts w:asciiTheme="minorHAnsi" w:eastAsiaTheme="minorEastAsia" w:hAnsiTheme="minorHAnsi" w:hint="eastAsia"/>
+          <w:noProof/>
+          <w:kern w:val="2"/>
+          <w:sz w:val="22"/>
+          <w:szCs w:val="24"/>
+          <w:lang w:eastAsia="zh-CN"/>
+          <w14:ligatures w14:val="standardContextual"/>
+        </w:rPr>
+      </w:pPr>
+      <w:hyperlink w:anchor="_Toc243297591" w:history="1">
+        <w:r>
+          <w:rPr>
+            <w:rStyle w:val="aff9"/>
+            <w:rFonts w:eastAsia="黑体"/>
+            <w:noProof/>
+          </w:rPr>
+          <w:t>5. Q3</w:t>
+        </w:r>
+        <w:r>
+          <w:rPr>
+            <w:rStyle w:val="aff9"/>
+            <w:rFonts w:eastAsia="黑体"/>
+            <w:noProof/>
+          </w:rPr>
+          <w:t>：明星是否更准</w:t>
+        </w:r>
+        <w:r>
+          <w:rPr>
+            <w:rFonts w:hint="eastAsia"/>
+            <w:noProof/>
+            <w:webHidden/>
+          </w:rPr>
+          <w:tab/>
+        </w:r>
+        <w:r>
+          <w:rPr>
+            <w:rFonts w:hint="eastAsia"/>
+            <w:noProof/>
+            <w:webHidden/>
+          </w:rPr>
+          <w:fldChar w:fldCharType="begin"/>
+        </w:r>
+        <w:r>
+          <w:rPr>
+            <w:rFonts w:hint="eastAsia"/>
+            <w:noProof/>
+            <w:webHidden/>
+          </w:rPr>
+          <w:instrText xml:space="preserve"> </w:instrText>
+        </w:r>
+        <w:r>
+          <w:rPr>
+            <w:noProof/>
+            <w:webHidden/>
+          </w:rPr>
+          <w:instrText>PAGEREF _Toc243297591 \h</w:instrText>
         </w:r>
         <w:r>
           <w:rPr>
@@ -2376,14 +2376,14 @@
           <w14:ligatures w14:val="standardContextual"/>
         </w:rPr>
       </w:pPr>
-      <w:hyperlink w:anchor="_Toc243297030" w:history="1">
+      <w:hyperlink w:anchor="_Toc243297592" w:history="1">
         <w:r>
           <w:rPr>
             <w:rStyle w:val="aff9"/>
             <w:rFonts w:eastAsia="黑体"/>
             <w:noProof/>
           </w:rPr>
-          <w:t xml:space="preserve">5.2 </w:t>
+          <w:t xml:space="preserve">5.1 </w:t>
         </w:r>
         <w:r>
           <w:rPr>
@@ -2391,7 +2391,7 @@
             <w:rFonts w:eastAsia="黑体"/>
             <w:noProof/>
           </w:rPr>
-          <w:t>问题真正问什么</w:t>
+          <w:t>问题原文</w:t>
         </w:r>
         <w:r>
           <w:rPr>
@@ -2422,7 +2422,7 @@
             <w:noProof/>
             <w:webHidden/>
           </w:rPr>
-          <w:instrText>PAGEREF _Toc243297030 \h</w:instrText>
+          <w:instrText>PAGEREF _Toc243297592 \h</w:instrText>
         </w:r>
         <w:r>
           <w:rPr>
@@ -2481,14 +2481,14 @@
           <w14:ligatures w14:val="standardContextual"/>
         </w:rPr>
       </w:pPr>
-      <w:hyperlink w:anchor="_Toc243297031" w:history="1">
+      <w:hyperlink w:anchor="_Toc243297593" w:history="1">
         <w:r>
           <w:rPr>
             <w:rStyle w:val="aff9"/>
             <w:rFonts w:eastAsia="黑体"/>
             <w:noProof/>
           </w:rPr>
-          <w:t xml:space="preserve">5.3 </w:t>
+          <w:t xml:space="preserve">5.2 </w:t>
         </w:r>
         <w:r>
           <w:rPr>
@@ -2496,7 +2496,7 @@
             <w:rFonts w:eastAsia="黑体"/>
             <w:noProof/>
           </w:rPr>
-          <w:t>我们的回答</w:t>
+          <w:t>问题真正问什么</w:t>
         </w:r>
         <w:r>
           <w:rPr>
@@ -2527,7 +2527,7 @@
             <w:noProof/>
             <w:webHidden/>
           </w:rPr>
-          <w:instrText>PAGEREF _Toc243297031 \h</w:instrText>
+          <w:instrText>PAGEREF _Toc243297593 \h</w:instrText>
         </w:r>
         <w:r>
           <w:rPr>
@@ -2586,14 +2586,14 @@
           <w14:ligatures w14:val="standardContextual"/>
         </w:rPr>
       </w:pPr>
-      <w:hyperlink w:anchor="_Toc243297032" w:history="1">
+      <w:hyperlink w:anchor="_Toc243297594" w:history="1">
         <w:r>
           <w:rPr>
             <w:rStyle w:val="aff9"/>
             <w:rFonts w:eastAsia="黑体"/>
             <w:noProof/>
           </w:rPr>
-          <w:t xml:space="preserve">5.4 </w:t>
+          <w:t xml:space="preserve">5.3 </w:t>
         </w:r>
         <w:r>
           <w:rPr>
@@ -2601,7 +2601,7 @@
             <w:rFonts w:eastAsia="黑体"/>
             <w:noProof/>
           </w:rPr>
-          <w:t>数字</w:t>
+          <w:t>我们的回答</w:t>
         </w:r>
         <w:r>
           <w:rPr>
@@ -2632,7 +2632,7 @@
             <w:noProof/>
             <w:webHidden/>
           </w:rPr>
-          <w:instrText>PAGEREF _Toc243297032 \h</w:instrText>
+          <w:instrText>PAGEREF _Toc243297594 \h</w:instrText>
         </w:r>
         <w:r>
           <w:rPr>
@@ -2662,7 +2662,7 @@
             <w:noProof/>
             <w:webHidden/>
           </w:rPr>
-          <w:t>7</w:t>
+          <w:t>8</w:t>
         </w:r>
         <w:r>
           <w:rPr>
@@ -2691,14 +2691,14 @@
           <w14:ligatures w14:val="standardContextual"/>
         </w:rPr>
       </w:pPr>
-      <w:hyperlink w:anchor="_Toc243297033" w:history="1">
+      <w:hyperlink w:anchor="_Toc243297595" w:history="1">
         <w:r>
           <w:rPr>
             <w:rStyle w:val="aff9"/>
             <w:rFonts w:eastAsia="黑体"/>
             <w:noProof/>
           </w:rPr>
-          <w:t xml:space="preserve">5.5 </w:t>
+          <w:t xml:space="preserve">5.4 </w:t>
         </w:r>
         <w:r>
           <w:rPr>
@@ -2706,7 +2706,7 @@
             <w:rFonts w:eastAsia="黑体"/>
             <w:noProof/>
           </w:rPr>
-          <w:t>底层逻辑</w:t>
+          <w:t>数字</w:t>
         </w:r>
         <w:r>
           <w:rPr>
@@ -2737,7 +2737,7 @@
             <w:noProof/>
             <w:webHidden/>
           </w:rPr>
-          <w:instrText>PAGEREF _Toc243297033 \h</w:instrText>
+          <w:instrText>PAGEREF _Toc243297595 \h</w:instrText>
         </w:r>
         <w:r>
           <w:rPr>
@@ -2796,14 +2796,14 @@
           <w14:ligatures w14:val="standardContextual"/>
         </w:rPr>
       </w:pPr>
-      <w:hyperlink w:anchor="_Toc243297034" w:history="1">
+      <w:hyperlink w:anchor="_Toc243297596" w:history="1">
         <w:r>
           <w:rPr>
             <w:rStyle w:val="aff9"/>
             <w:rFonts w:eastAsia="黑体"/>
             <w:noProof/>
           </w:rPr>
-          <w:t xml:space="preserve">5.6 </w:t>
+          <w:t xml:space="preserve">5.5 </w:t>
         </w:r>
         <w:r>
           <w:rPr>
@@ -2811,7 +2811,7 @@
             <w:rFonts w:eastAsia="黑体"/>
             <w:noProof/>
           </w:rPr>
-          <w:t>口播</w:t>
+          <w:t>底层逻辑</w:t>
         </w:r>
         <w:r>
           <w:rPr>
@@ -2842,7 +2842,7 @@
             <w:noProof/>
             <w:webHidden/>
           </w:rPr>
-          <w:instrText>PAGEREF _Toc243297034 \h</w:instrText>
+          <w:instrText>PAGEREF _Toc243297596 \h</w:instrText>
         </w:r>
         <w:r>
           <w:rPr>
@@ -2901,14 +2901,14 @@
           <w14:ligatures w14:val="standardContextual"/>
         </w:rPr>
       </w:pPr>
-      <w:hyperlink w:anchor="_Toc243297035" w:history="1">
+      <w:hyperlink w:anchor="_Toc243297597" w:history="1">
         <w:r>
           <w:rPr>
             <w:rStyle w:val="aff9"/>
             <w:rFonts w:eastAsia="黑体"/>
             <w:noProof/>
           </w:rPr>
-          <w:t xml:space="preserve">5.7 </w:t>
+          <w:t xml:space="preserve">5.6 </w:t>
         </w:r>
         <w:r>
           <w:rPr>
@@ -2916,7 +2916,7 @@
             <w:rFonts w:eastAsia="黑体"/>
             <w:noProof/>
           </w:rPr>
-          <w:t>不能说的话</w:t>
+          <w:t>口播</w:t>
         </w:r>
         <w:r>
           <w:rPr>
@@ -2947,111 +2947,7 @@
             <w:noProof/>
             <w:webHidden/>
           </w:rPr>
-          <w:instrText>PAGEREF _Toc243297035 \h</w:instrText>
-        </w:r>
-        <w:r>
-          <w:rPr>
-            <w:rFonts w:hint="eastAsia"/>
-            <w:noProof/>
-            <w:webHidden/>
-          </w:rPr>
-          <w:instrText xml:space="preserve"> </w:instrText>
-        </w:r>
-        <w:r>
-          <w:rPr>
-            <w:rFonts w:hint="eastAsia"/>
-            <w:noProof/>
-            <w:webHidden/>
-          </w:rPr>
-        </w:r>
-        <w:r>
-          <w:rPr>
-            <w:rFonts w:hint="eastAsia"/>
-            <w:noProof/>
-            <w:webHidden/>
-          </w:rPr>
-          <w:fldChar w:fldCharType="separate"/>
-        </w:r>
-        <w:r>
-          <w:rPr>
-            <w:noProof/>
-            <w:webHidden/>
-          </w:rPr>
-          <w:t>9</w:t>
-        </w:r>
-        <w:r>
-          <w:rPr>
-            <w:rFonts w:hint="eastAsia"/>
-            <w:noProof/>
-            <w:webHidden/>
-          </w:rPr>
-          <w:fldChar w:fldCharType="end"/>
-        </w:r>
-      </w:hyperlink>
-    </w:p>
-    <w:p>
-      <w:pPr>
-        <w:pStyle w:val="TOC1"/>
-        <w:tabs>
-          <w:tab w:val="right" w:leader="dot" w:pos="9402"/>
-        </w:tabs>
-        <w:rPr>
-          <w:rFonts w:asciiTheme="minorHAnsi" w:eastAsiaTheme="minorEastAsia" w:hAnsiTheme="minorHAnsi" w:hint="eastAsia"/>
-          <w:noProof/>
-          <w:kern w:val="2"/>
-          <w:sz w:val="22"/>
-          <w:szCs w:val="24"/>
-          <w:lang w:eastAsia="zh-CN"/>
-          <w14:ligatures w14:val="standardContextual"/>
-        </w:rPr>
-      </w:pPr>
-      <w:hyperlink w:anchor="_Toc243297036" w:history="1">
-        <w:r>
-          <w:rPr>
-            <w:rStyle w:val="aff9"/>
-            <w:rFonts w:eastAsia="黑体"/>
-            <w:noProof/>
-          </w:rPr>
-          <w:t>6. Q4</w:t>
-        </w:r>
-        <w:r>
-          <w:rPr>
-            <w:rStyle w:val="aff9"/>
-            <w:rFonts w:eastAsia="黑体"/>
-            <w:noProof/>
-          </w:rPr>
-          <w:t>：方向与券商层级</w:t>
-        </w:r>
-        <w:r>
-          <w:rPr>
-            <w:rFonts w:hint="eastAsia"/>
-            <w:noProof/>
-            <w:webHidden/>
-          </w:rPr>
-          <w:tab/>
-        </w:r>
-        <w:r>
-          <w:rPr>
-            <w:rFonts w:hint="eastAsia"/>
-            <w:noProof/>
-            <w:webHidden/>
-          </w:rPr>
-          <w:fldChar w:fldCharType="begin"/>
-        </w:r>
-        <w:r>
-          <w:rPr>
-            <w:rFonts w:hint="eastAsia"/>
-            <w:noProof/>
-            <w:webHidden/>
-          </w:rPr>
-          <w:instrText xml:space="preserve"> </w:instrText>
-        </w:r>
-        <w:r>
-          <w:rPr>
-            <w:noProof/>
-            <w:webHidden/>
-          </w:rPr>
-          <w:instrText>PAGEREF _Toc243297036 \h</w:instrText>
+          <w:instrText>PAGEREF _Toc243297597 \h</w:instrText>
         </w:r>
         <w:r>
           <w:rPr>
@@ -3110,14 +3006,14 @@
           <w14:ligatures w14:val="standardContextual"/>
         </w:rPr>
       </w:pPr>
-      <w:hyperlink w:anchor="_Toc243297037" w:history="1">
+      <w:hyperlink w:anchor="_Toc243297598" w:history="1">
         <w:r>
           <w:rPr>
             <w:rStyle w:val="aff9"/>
             <w:rFonts w:eastAsia="黑体"/>
             <w:noProof/>
           </w:rPr>
-          <w:t xml:space="preserve">6.1 </w:t>
+          <w:t xml:space="preserve">5.7 </w:t>
         </w:r>
         <w:r>
           <w:rPr>
@@ -3125,7 +3021,7 @@
             <w:rFonts w:eastAsia="黑体"/>
             <w:noProof/>
           </w:rPr>
-          <w:t>问题原文</w:t>
+          <w:t>不能说的话</w:t>
         </w:r>
         <w:r>
           <w:rPr>
@@ -3156,7 +3052,111 @@
             <w:noProof/>
             <w:webHidden/>
           </w:rPr>
-          <w:instrText>PAGEREF _Toc243297037 \h</w:instrText>
+          <w:instrText>PAGEREF _Toc243297598 \h</w:instrText>
+        </w:r>
+        <w:r>
+          <w:rPr>
+            <w:rFonts w:hint="eastAsia"/>
+            <w:noProof/>
+            <w:webHidden/>
+          </w:rPr>
+          <w:instrText xml:space="preserve"> </w:instrText>
+        </w:r>
+        <w:r>
+          <w:rPr>
+            <w:rFonts w:hint="eastAsia"/>
+            <w:noProof/>
+            <w:webHidden/>
+          </w:rPr>
+        </w:r>
+        <w:r>
+          <w:rPr>
+            <w:rFonts w:hint="eastAsia"/>
+            <w:noProof/>
+            <w:webHidden/>
+          </w:rPr>
+          <w:fldChar w:fldCharType="separate"/>
+        </w:r>
+        <w:r>
+          <w:rPr>
+            <w:noProof/>
+            <w:webHidden/>
+          </w:rPr>
+          <w:t>9</w:t>
+        </w:r>
+        <w:r>
+          <w:rPr>
+            <w:rFonts w:hint="eastAsia"/>
+            <w:noProof/>
+            <w:webHidden/>
+          </w:rPr>
+          <w:fldChar w:fldCharType="end"/>
+        </w:r>
+      </w:hyperlink>
+    </w:p>
+    <w:p>
+      <w:pPr>
+        <w:pStyle w:val="TOC1"/>
+        <w:tabs>
+          <w:tab w:val="right" w:leader="dot" w:pos="9402"/>
+        </w:tabs>
+        <w:rPr>
+          <w:rFonts w:asciiTheme="minorHAnsi" w:eastAsiaTheme="minorEastAsia" w:hAnsiTheme="minorHAnsi" w:hint="eastAsia"/>
+          <w:noProof/>
+          <w:kern w:val="2"/>
+          <w:sz w:val="22"/>
+          <w:szCs w:val="24"/>
+          <w:lang w:eastAsia="zh-CN"/>
+          <w14:ligatures w14:val="standardContextual"/>
+        </w:rPr>
+      </w:pPr>
+      <w:hyperlink w:anchor="_Toc243297599" w:history="1">
+        <w:r>
+          <w:rPr>
+            <w:rStyle w:val="aff9"/>
+            <w:rFonts w:eastAsia="黑体"/>
+            <w:noProof/>
+          </w:rPr>
+          <w:t>6. Q4</w:t>
+        </w:r>
+        <w:r>
+          <w:rPr>
+            <w:rStyle w:val="aff9"/>
+            <w:rFonts w:eastAsia="黑体"/>
+            <w:noProof/>
+          </w:rPr>
+          <w:t>：方向与券商层级</w:t>
+        </w:r>
+        <w:r>
+          <w:rPr>
+            <w:rFonts w:hint="eastAsia"/>
+            <w:noProof/>
+            <w:webHidden/>
+          </w:rPr>
+          <w:tab/>
+        </w:r>
+        <w:r>
+          <w:rPr>
+            <w:rFonts w:hint="eastAsia"/>
+            <w:noProof/>
+            <w:webHidden/>
+          </w:rPr>
+          <w:fldChar w:fldCharType="begin"/>
+        </w:r>
+        <w:r>
+          <w:rPr>
+            <w:rFonts w:hint="eastAsia"/>
+            <w:noProof/>
+            <w:webHidden/>
+          </w:rPr>
+          <w:instrText xml:space="preserve"> </w:instrText>
+        </w:r>
+        <w:r>
+          <w:rPr>
+            <w:noProof/>
+            <w:webHidden/>
+          </w:rPr>
+          <w:instrText>PAGEREF _Toc243297599 \h</w:instrText>
         </w:r>
         <w:r>
           <w:rPr>
@@ -3215,14 +3215,14 @@
           <w14:ligatures w14:val="standardContextual"/>
         </w:rPr>
       </w:pPr>
-      <w:hyperlink w:anchor="_Toc243297038" w:history="1">
+      <w:hyperlink w:anchor="_Toc243297600" w:history="1">
         <w:r>
           <w:rPr>
             <w:rStyle w:val="aff9"/>
             <w:rFonts w:eastAsia="黑体"/>
             <w:noProof/>
           </w:rPr>
-          <w:t xml:space="preserve">6.2 </w:t>
+          <w:t xml:space="preserve">6.1 </w:t>
         </w:r>
         <w:r>
           <w:rPr>
@@ -3230,7 +3230,7 @@
             <w:rFonts w:eastAsia="黑体"/>
             <w:noProof/>
           </w:rPr>
-          <w:t>问题真正问什么</w:t>
+          <w:t>问题原文</w:t>
         </w:r>
         <w:r>
           <w:rPr>
@@ -3261,7 +3261,7 @@
             <w:noProof/>
             <w:webHidden/>
           </w:rPr>
-          <w:instrText>PAGEREF _Toc243297038 \h</w:instrText>
+          <w:instrText>PAGEREF _Toc243297600 \h</w:instrText>
         </w:r>
         <w:r>
           <w:rPr>
@@ -3320,14 +3320,14 @@
           <w14:ligatures w14:val="standardContextual"/>
         </w:rPr>
       </w:pPr>
-      <w:hyperlink w:anchor="_Toc243297039" w:history="1">
+      <w:hyperlink w:anchor="_Toc243297601" w:history="1">
         <w:r>
           <w:rPr>
             <w:rStyle w:val="aff9"/>
             <w:rFonts w:eastAsia="黑体"/>
             <w:noProof/>
           </w:rPr>
-          <w:t xml:space="preserve">6.3 </w:t>
+          <w:t xml:space="preserve">6.2 </w:t>
         </w:r>
         <w:r>
           <w:rPr>
@@ -3335,7 +3335,7 @@
             <w:rFonts w:eastAsia="黑体"/>
             <w:noProof/>
           </w:rPr>
-          <w:t>我们的回答</w:t>
+          <w:t>问题真正问什么</w:t>
         </w:r>
         <w:r>
           <w:rPr>
@@ -3366,7 +3366,7 @@
             <w:noProof/>
             <w:webHidden/>
           </w:rPr>
-          <w:instrText>PAGEREF _Toc243297039 \h</w:instrText>
+          <w:instrText>PAGEREF _Toc243297601 \h</w:instrText>
         </w:r>
         <w:r>
           <w:rPr>
@@ -3425,14 +3425,14 @@
           <w14:ligatures w14:val="standardContextual"/>
         </w:rPr>
       </w:pPr>
-      <w:hyperlink w:anchor="_Toc243297040" w:history="1">
+      <w:hyperlink w:anchor="_Toc243297602" w:history="1">
         <w:r>
           <w:rPr>
             <w:rStyle w:val="aff9"/>
             <w:rFonts w:eastAsia="黑体"/>
             <w:noProof/>
           </w:rPr>
-          <w:t xml:space="preserve">6.4 </w:t>
+          <w:t xml:space="preserve">6.3 </w:t>
         </w:r>
         <w:r>
           <w:rPr>
@@ -3440,7 +3440,7 @@
             <w:rFonts w:eastAsia="黑体"/>
             <w:noProof/>
           </w:rPr>
-          <w:t>数字</w:t>
+          <w:t>我们的回答</w:t>
         </w:r>
         <w:r>
           <w:rPr>
@@ -3471,7 +3471,7 @@
             <w:noProof/>
             <w:webHidden/>
           </w:rPr>
-          <w:instrText>PAGEREF _Toc243297040 \h</w:instrText>
+          <w:instrText>PAGEREF _Toc243297602 \h</w:instrText>
         </w:r>
         <w:r>
           <w:rPr>
@@ -3530,14 +3530,14 @@
           <w14:ligatures w14:val="standardContextual"/>
         </w:rPr>
       </w:pPr>
-      <w:hyperlink w:anchor="_Toc243297041" w:history="1">
+      <w:hyperlink w:anchor="_Toc243297603" w:history="1">
         <w:r>
           <w:rPr>
             <w:rStyle w:val="aff9"/>
             <w:rFonts w:eastAsia="黑体"/>
             <w:noProof/>
           </w:rPr>
-          <w:t xml:space="preserve">6.5 </w:t>
+          <w:t xml:space="preserve">6.4 </w:t>
         </w:r>
         <w:r>
           <w:rPr>
@@ -3545,7 +3545,7 @@
             <w:rFonts w:eastAsia="黑体"/>
             <w:noProof/>
           </w:rPr>
-          <w:t>底层逻辑</w:t>
+          <w:t>数字</w:t>
         </w:r>
         <w:r>
           <w:rPr>
@@ -3576,7 +3576,7 @@
             <w:noProof/>
             <w:webHidden/>
           </w:rPr>
-          <w:instrText>PAGEREF _Toc243297041 \h</w:instrText>
+          <w:instrText>PAGEREF _Toc243297603 \h</w:instrText>
         </w:r>
         <w:r>
           <w:rPr>
@@ -3635,14 +3635,14 @@
           <w14:ligatures w14:val="standardContextual"/>
         </w:rPr>
       </w:pPr>
-      <w:hyperlink w:anchor="_Toc243297042" w:history="1">
+      <w:hyperlink w:anchor="_Toc243297604" w:history="1">
         <w:r>
           <w:rPr>
             <w:rStyle w:val="aff9"/>
             <w:rFonts w:eastAsia="黑体"/>
             <w:noProof/>
           </w:rPr>
-          <w:t xml:space="preserve">6.6 </w:t>
+          <w:t xml:space="preserve">6.5 </w:t>
         </w:r>
         <w:r>
           <w:rPr>
@@ -3650,7 +3650,7 @@
             <w:rFonts w:eastAsia="黑体"/>
             <w:noProof/>
           </w:rPr>
-          <w:t>口播</w:t>
+          <w:t>底层逻辑</w:t>
         </w:r>
         <w:r>
           <w:rPr>
@@ -3681,7 +3681,7 @@
             <w:noProof/>
             <w:webHidden/>
           </w:rPr>
-          <w:instrText>PAGEREF _Toc243297042 \h</w:instrText>
+          <w:instrText>PAGEREF _Toc243297604 \h</w:instrText>
         </w:r>
         <w:r>
           <w:rPr>
@@ -3740,14 +3740,14 @@
           <w14:ligatures w14:val="standardContextual"/>
         </w:rPr>
       </w:pPr>
-      <w:hyperlink w:anchor="_Toc243297043" w:history="1">
+      <w:hyperlink w:anchor="_Toc243297605" w:history="1">
         <w:r>
           <w:rPr>
             <w:rStyle w:val="aff9"/>
             <w:rFonts w:eastAsia="黑体"/>
             <w:noProof/>
           </w:rPr>
-          <w:t xml:space="preserve">6.7 </w:t>
+          <w:t xml:space="preserve">6.6 </w:t>
         </w:r>
         <w:r>
           <w:rPr>
@@ -3755,7 +3755,7 @@
             <w:rFonts w:eastAsia="黑体"/>
             <w:noProof/>
           </w:rPr>
-          <w:t>不能说的话</w:t>
+          <w:t>口播</w:t>
         </w:r>
         <w:r>
           <w:rPr>
@@ -3786,7 +3786,7 @@
             <w:noProof/>
             <w:webHidden/>
           </w:rPr>
-          <w:instrText>PAGEREF _Toc243297043 \h</w:instrText>
+          <w:instrText>PAGEREF _Toc243297605 \h</w:instrText>
         </w:r>
         <w:r>
           <w:rPr>
@@ -3817,318 +3817,6 @@
             <w:webHidden/>
           </w:rPr>
           <w:t>10</w:t>
-        </w:r>
-        <w:r>
-          <w:rPr>
-            <w:rFonts w:hint="eastAsia"/>
-            <w:noProof/>
-            <w:webHidden/>
-          </w:rPr>
-          <w:fldChar w:fldCharType="end"/>
-        </w:r>
-      </w:hyperlink>
-    </w:p>
-    <w:p>
-      <w:pPr>
-        <w:pStyle w:val="TOC1"/>
-        <w:tabs>
-          <w:tab w:val="right" w:leader="dot" w:pos="9402"/>
-        </w:tabs>
-        <w:rPr>
-          <w:rFonts w:asciiTheme="minorHAnsi" w:eastAsiaTheme="minorEastAsia" w:hAnsiTheme="minorHAnsi" w:hint="eastAsia"/>
-          <w:noProof/>
-          <w:kern w:val="2"/>
-          <w:sz w:val="22"/>
-          <w:szCs w:val="24"/>
-          <w:lang w:eastAsia="zh-CN"/>
-          <w14:ligatures w14:val="standardContextual"/>
-        </w:rPr>
-      </w:pPr>
-      <w:hyperlink w:anchor="_Toc243297044" w:history="1">
-        <w:r>
-          <w:rPr>
-            <w:rStyle w:val="aff9"/>
-            <w:rFonts w:eastAsia="黑体"/>
-            <w:noProof/>
-          </w:rPr>
-          <w:t xml:space="preserve">7. </w:t>
-        </w:r>
-        <w:r>
-          <w:rPr>
-            <w:rStyle w:val="aff9"/>
-            <w:rFonts w:eastAsia="黑体"/>
-            <w:noProof/>
-          </w:rPr>
-          <w:t>四个回答合起来</w:t>
-        </w:r>
-        <w:r>
-          <w:rPr>
-            <w:rFonts w:hint="eastAsia"/>
-            <w:noProof/>
-            <w:webHidden/>
-          </w:rPr>
-          <w:tab/>
-        </w:r>
-        <w:r>
-          <w:rPr>
-            <w:rFonts w:hint="eastAsia"/>
-            <w:noProof/>
-            <w:webHidden/>
-          </w:rPr>
-          <w:fldChar w:fldCharType="begin"/>
-        </w:r>
-        <w:r>
-          <w:rPr>
-            <w:rFonts w:hint="eastAsia"/>
-            <w:noProof/>
-            <w:webHidden/>
-          </w:rPr>
-          <w:instrText xml:space="preserve"> </w:instrText>
-        </w:r>
-        <w:r>
-          <w:rPr>
-            <w:noProof/>
-            <w:webHidden/>
-          </w:rPr>
-          <w:instrText>PAGEREF _Toc243297044 \h</w:instrText>
-        </w:r>
-        <w:r>
-          <w:rPr>
-            <w:rFonts w:hint="eastAsia"/>
-            <w:noProof/>
-            <w:webHidden/>
-          </w:rPr>
-          <w:instrText xml:space="preserve"> </w:instrText>
-        </w:r>
-        <w:r>
-          <w:rPr>
-            <w:rFonts w:hint="eastAsia"/>
-            <w:noProof/>
-            <w:webHidden/>
-          </w:rPr>
-        </w:r>
-        <w:r>
-          <w:rPr>
-            <w:rFonts w:hint="eastAsia"/>
-            <w:noProof/>
-            <w:webHidden/>
-          </w:rPr>
-          <w:fldChar w:fldCharType="separate"/>
-        </w:r>
-        <w:r>
-          <w:rPr>
-            <w:noProof/>
-            <w:webHidden/>
-          </w:rPr>
-          <w:t>10</w:t>
-        </w:r>
-        <w:r>
-          <w:rPr>
-            <w:rFonts w:hint="eastAsia"/>
-            <w:noProof/>
-            <w:webHidden/>
-          </w:rPr>
-          <w:fldChar w:fldCharType="end"/>
-        </w:r>
-      </w:hyperlink>
-    </w:p>
-    <w:p>
-      <w:pPr>
-        <w:pStyle w:val="TOC1"/>
-        <w:tabs>
-          <w:tab w:val="right" w:leader="dot" w:pos="9402"/>
-        </w:tabs>
-        <w:rPr>
-          <w:rFonts w:asciiTheme="minorHAnsi" w:eastAsiaTheme="minorEastAsia" w:hAnsiTheme="minorHAnsi" w:hint="eastAsia"/>
-          <w:noProof/>
-          <w:kern w:val="2"/>
-          <w:sz w:val="22"/>
-          <w:szCs w:val="24"/>
-          <w:lang w:eastAsia="zh-CN"/>
-          <w14:ligatures w14:val="standardContextual"/>
-        </w:rPr>
-      </w:pPr>
-      <w:hyperlink w:anchor="_Toc243297045" w:history="1">
-        <w:r>
-          <w:rPr>
-            <w:rStyle w:val="aff9"/>
-            <w:rFonts w:eastAsia="黑体"/>
-            <w:noProof/>
-          </w:rPr>
-          <w:t xml:space="preserve">8. </w:t>
-        </w:r>
-        <w:r>
-          <w:rPr>
-            <w:rStyle w:val="aff9"/>
-            <w:rFonts w:eastAsia="黑体"/>
-            <w:noProof/>
-          </w:rPr>
-          <w:t>每页一句话与过渡</w:t>
-        </w:r>
-        <w:r>
-          <w:rPr>
-            <w:rFonts w:hint="eastAsia"/>
-            <w:noProof/>
-            <w:webHidden/>
-          </w:rPr>
-          <w:tab/>
-        </w:r>
-        <w:r>
-          <w:rPr>
-            <w:rFonts w:hint="eastAsia"/>
-            <w:noProof/>
-            <w:webHidden/>
-          </w:rPr>
-          <w:fldChar w:fldCharType="begin"/>
-        </w:r>
-        <w:r>
-          <w:rPr>
-            <w:rFonts w:hint="eastAsia"/>
-            <w:noProof/>
-            <w:webHidden/>
-          </w:rPr>
-          <w:instrText xml:space="preserve"> </w:instrText>
-        </w:r>
-        <w:r>
-          <w:rPr>
-            <w:noProof/>
-            <w:webHidden/>
-          </w:rPr>
-          <w:instrText>PAGEREF _Toc243297045 \h</w:instrText>
-        </w:r>
-        <w:r>
-          <w:rPr>
-            <w:rFonts w:hint="eastAsia"/>
-            <w:noProof/>
-            <w:webHidden/>
-          </w:rPr>
-          <w:instrText xml:space="preserve"> </w:instrText>
-        </w:r>
-        <w:r>
-          <w:rPr>
-            <w:rFonts w:hint="eastAsia"/>
-            <w:noProof/>
-            <w:webHidden/>
-          </w:rPr>
-        </w:r>
-        <w:r>
-          <w:rPr>
-            <w:rFonts w:hint="eastAsia"/>
-            <w:noProof/>
-            <w:webHidden/>
-          </w:rPr>
-          <w:fldChar w:fldCharType="separate"/>
-        </w:r>
-        <w:r>
-          <w:rPr>
-            <w:noProof/>
-            <w:webHidden/>
-          </w:rPr>
-          <w:t>11</w:t>
-        </w:r>
-        <w:r>
-          <w:rPr>
-            <w:rFonts w:hint="eastAsia"/>
-            <w:noProof/>
-            <w:webHidden/>
-          </w:rPr>
-          <w:fldChar w:fldCharType="end"/>
-        </w:r>
-      </w:hyperlink>
-    </w:p>
-    <w:p>
-      <w:pPr>
-        <w:pStyle w:val="TOC1"/>
-        <w:tabs>
-          <w:tab w:val="right" w:leader="dot" w:pos="9402"/>
-        </w:tabs>
-        <w:rPr>
-          <w:rFonts w:asciiTheme="minorHAnsi" w:eastAsiaTheme="minorEastAsia" w:hAnsiTheme="minorHAnsi" w:hint="eastAsia"/>
-          <w:noProof/>
-          <w:kern w:val="2"/>
-          <w:sz w:val="22"/>
-          <w:szCs w:val="24"/>
-          <w:lang w:eastAsia="zh-CN"/>
-          <w14:ligatures w14:val="standardContextual"/>
-        </w:rPr>
-      </w:pPr>
-      <w:hyperlink w:anchor="_Toc243297046" w:history="1">
-        <w:r>
-          <w:rPr>
-            <w:rStyle w:val="aff9"/>
-            <w:rFonts w:eastAsia="黑体"/>
-            <w:noProof/>
-          </w:rPr>
-          <w:t xml:space="preserve">9. Q&amp;A </w:t>
-        </w:r>
-        <w:r>
-          <w:rPr>
-            <w:rStyle w:val="aff9"/>
-            <w:rFonts w:eastAsia="黑体"/>
-            <w:noProof/>
-          </w:rPr>
-          <w:t>防守</w:t>
-        </w:r>
-        <w:r>
-          <w:rPr>
-            <w:rFonts w:hint="eastAsia"/>
-            <w:noProof/>
-            <w:webHidden/>
-          </w:rPr>
-          <w:tab/>
-        </w:r>
-        <w:r>
-          <w:rPr>
-            <w:rFonts w:hint="eastAsia"/>
-            <w:noProof/>
-            <w:webHidden/>
-          </w:rPr>
-          <w:fldChar w:fldCharType="begin"/>
-        </w:r>
-        <w:r>
-          <w:rPr>
-            <w:rFonts w:hint="eastAsia"/>
-            <w:noProof/>
-            <w:webHidden/>
-          </w:rPr>
-          <w:instrText xml:space="preserve"> </w:instrText>
-        </w:r>
-        <w:r>
-          <w:rPr>
-            <w:noProof/>
-            <w:webHidden/>
-          </w:rPr>
-          <w:instrText>PAGEREF _Toc243297046 \h</w:instrText>
-        </w:r>
-        <w:r>
-          <w:rPr>
-            <w:rFonts w:hint="eastAsia"/>
-            <w:noProof/>
-            <w:webHidden/>
-          </w:rPr>
-          <w:instrText xml:space="preserve"> </w:instrText>
-        </w:r>
-        <w:r>
-          <w:rPr>
-            <w:rFonts w:hint="eastAsia"/>
-            <w:noProof/>
-            <w:webHidden/>
-          </w:rPr>
-        </w:r>
-        <w:r>
-          <w:rPr>
-            <w:rFonts w:hint="eastAsia"/>
-            <w:noProof/>
-            <w:webHidden/>
-          </w:rPr>
-          <w:fldChar w:fldCharType="separate"/>
-        </w:r>
-        <w:r>
-          <w:rPr>
-            <w:noProof/>
-            <w:webHidden/>
-          </w:rPr>
-          <w:t>11</w:t>
         </w:r>
         <w:r>
           <w:rPr>
@@ -4157,14 +3845,14 @@
           <w14:ligatures w14:val="standardContextual"/>
         </w:rPr>
       </w:pPr>
-      <w:hyperlink w:anchor="_Toc243297047" w:history="1">
+      <w:hyperlink w:anchor="_Toc243297606" w:history="1">
         <w:r>
           <w:rPr>
             <w:rStyle w:val="aff9"/>
             <w:rFonts w:eastAsia="黑体"/>
             <w:noProof/>
           </w:rPr>
-          <w:t xml:space="preserve">9.1 </w:t>
+          <w:t xml:space="preserve">6.7 </w:t>
         </w:r>
         <w:r>
           <w:rPr>
@@ -4172,15 +3860,103 @@
             <w:rFonts w:eastAsia="黑体"/>
             <w:noProof/>
           </w:rPr>
-          <w:t>成交量</w:t>
-        </w:r>
+          <w:t>不能说的话</w:t>
+        </w:r>
+        <w:r>
+          <w:rPr>
+            <w:rFonts w:hint="eastAsia"/>
+            <w:noProof/>
+            <w:webHidden/>
+          </w:rPr>
+          <w:tab/>
+        </w:r>
+        <w:r>
+          <w:rPr>
+            <w:rFonts w:hint="eastAsia"/>
+            <w:noProof/>
+            <w:webHidden/>
+          </w:rPr>
+          <w:fldChar w:fldCharType="begin"/>
+        </w:r>
+        <w:r>
+          <w:rPr>
+            <w:rFonts w:hint="eastAsia"/>
+            <w:noProof/>
+            <w:webHidden/>
+          </w:rPr>
+          <w:instrText xml:space="preserve"> </w:instrText>
+        </w:r>
+        <w:r>
+          <w:rPr>
+            <w:noProof/>
+            <w:webHidden/>
+          </w:rPr>
+          <w:instrText>PAGEREF _Toc243297606 \h</w:instrText>
+        </w:r>
+        <w:r>
+          <w:rPr>
+            <w:rFonts w:hint="eastAsia"/>
+            <w:noProof/>
+            <w:webHidden/>
+          </w:rPr>
+          <w:instrText xml:space="preserve"> </w:instrText>
+        </w:r>
+        <w:r>
+          <w:rPr>
+            <w:rFonts w:hint="eastAsia"/>
+            <w:noProof/>
+            <w:webHidden/>
+          </w:rPr>
+        </w:r>
+        <w:r>
+          <w:rPr>
+            <w:rFonts w:hint="eastAsia"/>
+            <w:noProof/>
+            <w:webHidden/>
+          </w:rPr>
+          <w:fldChar w:fldCharType="separate"/>
+        </w:r>
+        <w:r>
+          <w:rPr>
+            <w:noProof/>
+            <w:webHidden/>
+          </w:rPr>
+          <w:t>11</w:t>
+        </w:r>
+        <w:r>
+          <w:rPr>
+            <w:rFonts w:hint="eastAsia"/>
+            <w:noProof/>
+            <w:webHidden/>
+          </w:rPr>
+          <w:fldChar w:fldCharType="end"/>
+        </w:r>
+      </w:hyperlink>
+    </w:p>
+    <w:p>
+      <w:pPr>
+        <w:pStyle w:val="TOC1"/>
+        <w:tabs>
+          <w:tab w:val="right" w:leader="dot" w:pos="9402"/>
+        </w:tabs>
+        <w:rPr>
+          <w:rFonts w:asciiTheme="minorHAnsi" w:eastAsiaTheme="minorEastAsia" w:hAnsiTheme="minorHAnsi" w:hint="eastAsia"/>
+          <w:noProof/>
+          <w:kern w:val="2"/>
+          <w:sz w:val="22"/>
+          <w:szCs w:val="24"/>
+          <w:lang w:eastAsia="zh-CN"/>
+          <w14:ligatures w14:val="standardContextual"/>
+        </w:rPr>
+      </w:pPr>
+      <w:hyperlink w:anchor="_Toc243297607" w:history="1">
         <w:r>
           <w:rPr>
             <w:rStyle w:val="aff9"/>
             <w:rFonts w:eastAsia="黑体"/>
             <w:noProof/>
           </w:rPr>
-          <w:t xml:space="preserve"> +0.053 </w:t>
+          <w:t xml:space="preserve">7. </w:t>
         </w:r>
         <w:r>
           <w:rPr>
@@ -4188,7 +3964,7 @@
             <w:rFonts w:eastAsia="黑体"/>
             <w:noProof/>
           </w:rPr>
-          <w:t>有多大？</w:t>
+          <w:t>四个回答合起来</w:t>
         </w:r>
         <w:r>
           <w:rPr>
@@ -4219,7 +3995,7 @@
             <w:noProof/>
             <w:webHidden/>
           </w:rPr>
-          <w:instrText>PAGEREF _Toc243297047 \h</w:instrText>
+          <w:instrText>PAGEREF _Toc243297607 \h</w:instrText>
         </w:r>
         <w:r>
           <w:rPr>
@@ -4250,6 +4026,214 @@
             <w:webHidden/>
           </w:rPr>
           <w:t>11</w:t>
+        </w:r>
+        <w:r>
+          <w:rPr>
+            <w:rFonts w:hint="eastAsia"/>
+            <w:noProof/>
+            <w:webHidden/>
+          </w:rPr>
+          <w:fldChar w:fldCharType="end"/>
+        </w:r>
+      </w:hyperlink>
+    </w:p>
+    <w:p>
+      <w:pPr>
+        <w:pStyle w:val="TOC1"/>
+        <w:tabs>
+          <w:tab w:val="right" w:leader="dot" w:pos="9402"/>
+        </w:tabs>
+        <w:rPr>
+          <w:rFonts w:asciiTheme="minorHAnsi" w:eastAsiaTheme="minorEastAsia" w:hAnsiTheme="minorHAnsi" w:hint="eastAsia"/>
+          <w:noProof/>
+          <w:kern w:val="2"/>
+          <w:sz w:val="22"/>
+          <w:szCs w:val="24"/>
+          <w:lang w:eastAsia="zh-CN"/>
+          <w14:ligatures w14:val="standardContextual"/>
+        </w:rPr>
+      </w:pPr>
+      <w:hyperlink w:anchor="_Toc243297608" w:history="1">
+        <w:r>
+          <w:rPr>
+            <w:rStyle w:val="aff9"/>
+            <w:rFonts w:eastAsia="黑体"/>
+            <w:noProof/>
+          </w:rPr>
+          <w:t xml:space="preserve">8. </w:t>
+        </w:r>
+        <w:r>
+          <w:rPr>
+            <w:rStyle w:val="aff9"/>
+            <w:rFonts w:eastAsia="黑体"/>
+            <w:noProof/>
+          </w:rPr>
+          <w:t>每页一句话与过渡</w:t>
+        </w:r>
+        <w:r>
+          <w:rPr>
+            <w:rFonts w:hint="eastAsia"/>
+            <w:noProof/>
+            <w:webHidden/>
+          </w:rPr>
+          <w:tab/>
+        </w:r>
+        <w:r>
+          <w:rPr>
+            <w:rFonts w:hint="eastAsia"/>
+            <w:noProof/>
+            <w:webHidden/>
+          </w:rPr>
+          <w:fldChar w:fldCharType="begin"/>
+        </w:r>
+        <w:r>
+          <w:rPr>
+            <w:rFonts w:hint="eastAsia"/>
+            <w:noProof/>
+            <w:webHidden/>
+          </w:rPr>
+          <w:instrText xml:space="preserve"> </w:instrText>
+        </w:r>
+        <w:r>
+          <w:rPr>
+            <w:noProof/>
+            <w:webHidden/>
+          </w:rPr>
+          <w:instrText>PAGEREF _Toc243297608 \h</w:instrText>
+        </w:r>
+        <w:r>
+          <w:rPr>
+            <w:rFonts w:hint="eastAsia"/>
+            <w:noProof/>
+            <w:webHidden/>
+          </w:rPr>
+          <w:instrText xml:space="preserve"> </w:instrText>
+        </w:r>
+        <w:r>
+          <w:rPr>
+            <w:rFonts w:hint="eastAsia"/>
+            <w:noProof/>
+            <w:webHidden/>
+          </w:rPr>
+        </w:r>
+        <w:r>
+          <w:rPr>
+            <w:rFonts w:hint="eastAsia"/>
+            <w:noProof/>
+            <w:webHidden/>
+          </w:rPr>
+          <w:fldChar w:fldCharType="separate"/>
+        </w:r>
+        <w:r>
+          <w:rPr>
+            <w:noProof/>
+            <w:webHidden/>
+          </w:rPr>
+          <w:t>11</w:t>
+        </w:r>
+        <w:r>
+          <w:rPr>
+            <w:rFonts w:hint="eastAsia"/>
+            <w:noProof/>
+            <w:webHidden/>
+          </w:rPr>
+          <w:fldChar w:fldCharType="end"/>
+        </w:r>
+      </w:hyperlink>
+    </w:p>
+    <w:p>
+      <w:pPr>
+        <w:pStyle w:val="TOC1"/>
+        <w:tabs>
+          <w:tab w:val="right" w:leader="dot" w:pos="9402"/>
+        </w:tabs>
+        <w:rPr>
+          <w:rFonts w:asciiTheme="minorHAnsi" w:eastAsiaTheme="minorEastAsia" w:hAnsiTheme="minorHAnsi" w:hint="eastAsia"/>
+          <w:noProof/>
+          <w:kern w:val="2"/>
+          <w:sz w:val="22"/>
+          <w:szCs w:val="24"/>
+          <w:lang w:eastAsia="zh-CN"/>
+          <w14:ligatures w14:val="standardContextual"/>
+        </w:rPr>
+      </w:pPr>
+      <w:hyperlink w:anchor="_Toc243297609" w:history="1">
+        <w:r>
+          <w:rPr>
+            <w:rStyle w:val="aff9"/>
+            <w:rFonts w:eastAsia="黑体"/>
+            <w:noProof/>
+          </w:rPr>
+          <w:t xml:space="preserve">9. Q&amp;A </w:t>
+        </w:r>
+        <w:r>
+          <w:rPr>
+            <w:rStyle w:val="aff9"/>
+            <w:rFonts w:eastAsia="黑体"/>
+            <w:noProof/>
+          </w:rPr>
+          <w:t>防守</w:t>
+        </w:r>
+        <w:r>
+          <w:rPr>
+            <w:rFonts w:hint="eastAsia"/>
+            <w:noProof/>
+            <w:webHidden/>
+          </w:rPr>
+          <w:tab/>
+        </w:r>
+        <w:r>
+          <w:rPr>
+            <w:rFonts w:hint="eastAsia"/>
+            <w:noProof/>
+            <w:webHidden/>
+          </w:rPr>
+          <w:fldChar w:fldCharType="begin"/>
+        </w:r>
+        <w:r>
+          <w:rPr>
+            <w:rFonts w:hint="eastAsia"/>
+            <w:noProof/>
+            <w:webHidden/>
+          </w:rPr>
+          <w:instrText xml:space="preserve"> </w:instrText>
+        </w:r>
+        <w:r>
+          <w:rPr>
+            <w:noProof/>
+            <w:webHidden/>
+          </w:rPr>
+          <w:instrText>PAGEREF _Toc243297609 \h</w:instrText>
+        </w:r>
+        <w:r>
+          <w:rPr>
+            <w:rFonts w:hint="eastAsia"/>
+            <w:noProof/>
+            <w:webHidden/>
+          </w:rPr>
+          <w:instrText xml:space="preserve"> </w:instrText>
+        </w:r>
+        <w:r>
+          <w:rPr>
+            <w:rFonts w:hint="eastAsia"/>
+            <w:noProof/>
+            <w:webHidden/>
+          </w:rPr>
+        </w:r>
+        <w:r>
+          <w:rPr>
+            <w:rFonts w:hint="eastAsia"/>
+            <w:noProof/>
+            <w:webHidden/>
+          </w:rPr>
+          <w:fldChar w:fldCharType="separate"/>
+        </w:r>
+        <w:r>
+          <w:rPr>
+            <w:noProof/>
+            <w:webHidden/>
+          </w:rPr>
+          <w:t>12</w:t>
         </w:r>
         <w:r>
           <w:rPr>
@@ -4278,14 +4262,14 @@
           <w14:ligatures w14:val="standardContextual"/>
         </w:rPr>
       </w:pPr>
-      <w:hyperlink w:anchor="_Toc243297048" w:history="1">
+      <w:hyperlink w:anchor="_Toc243297610" w:history="1">
         <w:r>
           <w:rPr>
             <w:rStyle w:val="aff9"/>
             <w:rFonts w:eastAsia="黑体"/>
             <w:noProof/>
           </w:rPr>
-          <w:t xml:space="preserve">9.2 </w:t>
+          <w:t xml:space="preserve">9.1 </w:t>
         </w:r>
         <w:r>
           <w:rPr>
@@ -4293,7 +4277,23 @@
             <w:rFonts w:eastAsia="黑体"/>
             <w:noProof/>
           </w:rPr>
-          <w:t>成交量对涨跌停稳健吗？</w:t>
+          <w:t>成交量</w:t>
+        </w:r>
+        <w:r>
+          <w:rPr>
+            <w:rStyle w:val="aff9"/>
+            <w:rFonts w:eastAsia="黑体"/>
+            <w:noProof/>
+          </w:rPr>
+          <w:t xml:space="preserve"> +0.053 </w:t>
+        </w:r>
+        <w:r>
+          <w:rPr>
+            <w:rStyle w:val="aff9"/>
+            <w:rFonts w:eastAsia="黑体"/>
+            <w:noProof/>
+          </w:rPr>
+          <w:t>有多大？</w:t>
         </w:r>
         <w:r>
           <w:rPr>
@@ -4324,7 +4324,7 @@
             <w:noProof/>
             <w:webHidden/>
           </w:rPr>
-          <w:instrText>PAGEREF _Toc243297048 \h</w:instrText>
+          <w:instrText>PAGEREF _Toc243297610 \h</w:instrText>
         </w:r>
         <w:r>
           <w:rPr>
@@ -4354,7 +4354,7 @@
             <w:noProof/>
             <w:webHidden/>
           </w:rPr>
-          <w:t>11</w:t>
+          <w:t>12</w:t>
         </w:r>
         <w:r>
           <w:rPr>
@@ -4383,14 +4383,14 @@
           <w14:ligatures w14:val="standardContextual"/>
         </w:rPr>
       </w:pPr>
-      <w:hyperlink w:anchor="_Toc243297049" w:history="1">
+      <w:hyperlink w:anchor="_Toc243297611" w:history="1">
         <w:r>
           <w:rPr>
             <w:rStyle w:val="aff9"/>
             <w:rFonts w:eastAsia="黑体"/>
             <w:noProof/>
           </w:rPr>
-          <w:t xml:space="preserve">9.3 </w:t>
+          <w:t xml:space="preserve">9.2 </w:t>
         </w:r>
         <w:r>
           <w:rPr>
@@ -4398,7 +4398,7 @@
             <w:rFonts w:eastAsia="黑体"/>
             <w:noProof/>
           </w:rPr>
-          <w:t>短期持有收益支持明星，为什么还说是影响力？</w:t>
+          <w:t>成交量对涨跌停稳健吗？</w:t>
         </w:r>
         <w:r>
           <w:rPr>
@@ -4429,7 +4429,7 @@
             <w:noProof/>
             <w:webHidden/>
           </w:rPr>
-          <w:instrText>PAGEREF _Toc243297049 \h</w:instrText>
+          <w:instrText>PAGEREF _Toc243297611 \h</w:instrText>
         </w:r>
         <w:r>
           <w:rPr>
@@ -4488,14 +4488,14 @@
           <w14:ligatures w14:val="standardContextual"/>
         </w:rPr>
       </w:pPr>
-      <w:hyperlink w:anchor="_Toc243297050" w:history="1">
+      <w:hyperlink w:anchor="_Toc243297612" w:history="1">
         <w:r>
           <w:rPr>
             <w:rStyle w:val="aff9"/>
             <w:rFonts w:eastAsia="黑体"/>
             <w:noProof/>
           </w:rPr>
-          <w:t xml:space="preserve">9.4 </w:t>
+          <w:t xml:space="preserve">9.3 </w:t>
         </w:r>
         <w:r>
           <w:rPr>
@@ -4503,7 +4503,7 @@
             <w:rFonts w:eastAsia="黑体"/>
             <w:noProof/>
           </w:rPr>
-          <w:t>为什么不是过度反应？</w:t>
+          <w:t>短期持有收益支持明星，为什么还说是影响力？</w:t>
         </w:r>
         <w:r>
           <w:rPr>
@@ -4534,7 +4534,7 @@
             <w:noProof/>
             <w:webHidden/>
           </w:rPr>
-          <w:instrText>PAGEREF _Toc243297050 \h</w:instrText>
+          <w:instrText>PAGEREF _Toc243297612 \h</w:instrText>
         </w:r>
         <w:r>
           <w:rPr>
@@ -4593,14 +4593,14 @@
           <w14:ligatures w14:val="standardContextual"/>
         </w:rPr>
       </w:pPr>
-      <w:hyperlink w:anchor="_Toc243297051" w:history="1">
+      <w:hyperlink w:anchor="_Toc243297613" w:history="1">
         <w:r>
           <w:rPr>
             <w:rStyle w:val="aff9"/>
             <w:rFonts w:eastAsia="黑体"/>
             <w:noProof/>
           </w:rPr>
-          <w:t xml:space="preserve">9.5 </w:t>
+          <w:t xml:space="preserve">9.4 </w:t>
         </w:r>
         <w:r>
           <w:rPr>
@@ -4608,7 +4608,7 @@
             <w:rFonts w:eastAsia="黑体"/>
             <w:noProof/>
           </w:rPr>
-          <w:t>为什么层级不稳定？</w:t>
+          <w:t>为什么不是过度反应？</w:t>
         </w:r>
         <w:r>
           <w:rPr>
@@ -4639,7 +4639,7 @@
             <w:noProof/>
             <w:webHidden/>
           </w:rPr>
-          <w:instrText>PAGEREF _Toc243297051 \h</w:instrText>
+          <w:instrText>PAGEREF _Toc243297613 \h</w:instrText>
         </w:r>
         <w:r>
           <w:rPr>
@@ -4698,14 +4698,14 @@
           <w14:ligatures w14:val="standardContextual"/>
         </w:rPr>
       </w:pPr>
-      <w:hyperlink w:anchor="_Toc243297052" w:history="1">
+      <w:hyperlink w:anchor="_Toc243297614" w:history="1">
         <w:r>
           <w:rPr>
             <w:rStyle w:val="aff9"/>
             <w:rFonts w:eastAsia="黑体"/>
             <w:noProof/>
           </w:rPr>
-          <w:t xml:space="preserve">9.6 </w:t>
+          <w:t xml:space="preserve">9.5 </w:t>
         </w:r>
         <w:r>
           <w:rPr>
@@ -4713,7 +4713,7 @@
             <w:rFonts w:eastAsia="黑体"/>
             <w:noProof/>
           </w:rPr>
-          <w:t>多重检验怎么办？</w:t>
+          <w:t>为什么层级不稳定？</w:t>
         </w:r>
         <w:r>
           <w:rPr>
@@ -4744,7 +4744,7 @@
             <w:noProof/>
             <w:webHidden/>
           </w:rPr>
-          <w:instrText>PAGEREF _Toc243297052 \h</w:instrText>
+          <w:instrText>PAGEREF _Toc243297614 \h</w:instrText>
         </w:r>
         <w:r>
           <w:rPr>
@@ -4803,14 +4803,14 @@
           <w14:ligatures w14:val="standardContextual"/>
         </w:rPr>
       </w:pPr>
-      <w:hyperlink w:anchor="_Toc243297053" w:history="1">
+      <w:hyperlink w:anchor="_Toc243297615" w:history="1">
         <w:r>
           <w:rPr>
             <w:rStyle w:val="aff9"/>
             <w:rFonts w:eastAsia="黑体"/>
             <w:noProof/>
           </w:rPr>
-          <w:t xml:space="preserve">9.7 </w:t>
+          <w:t xml:space="preserve">9.6 </w:t>
         </w:r>
         <w:r>
           <w:rPr>
@@ -4818,15 +4818,104 @@
             <w:rFonts w:eastAsia="黑体"/>
             <w:noProof/>
           </w:rPr>
-          <w:t>为什么</w:t>
-        </w:r>
+          <w:t>多重检验怎么办？</w:t>
+        </w:r>
+        <w:r>
+          <w:rPr>
+            <w:rFonts w:hint="eastAsia"/>
+            <w:noProof/>
+            <w:webHidden/>
+          </w:rPr>
+          <w:tab/>
+        </w:r>
+        <w:r>
+          <w:rPr>
+            <w:rFonts w:hint="eastAsia"/>
+            <w:noProof/>
+            <w:webHidden/>
+          </w:rPr>
+          <w:fldChar w:fldCharType="begin"/>
+        </w:r>
+        <w:r>
+          <w:rPr>
+            <w:rFonts w:hint="eastAsia"/>
+            <w:noProof/>
+            <w:webHidden/>
+          </w:rPr>
+          <w:instrText xml:space="preserve"> </w:instrText>
+        </w:r>
+        <w:r>
+          <w:rPr>
+            <w:noProof/>
+            <w:webHidden/>
+          </w:rPr>
+          <w:instrText>PAGEREF _Toc243297615 \h</w:instrText>
+        </w:r>
+        <w:r>
+          <w:rPr>
+            <w:rFonts w:hint="eastAsia"/>
+            <w:noProof/>
+            <w:webHidden/>
+          </w:rPr>
+          <w:instrText xml:space="preserve"> </w:instrText>
+        </w:r>
+        <w:r>
+          <w:rPr>
+            <w:rFonts w:hint="eastAsia"/>
+            <w:noProof/>
+            <w:webHidden/>
+          </w:rPr>
+        </w:r>
+        <w:r>
+          <w:rPr>
+            <w:rFonts w:hint="eastAsia"/>
+            <w:noProof/>
+            <w:webHidden/>
+          </w:rPr>
+          <w:fldChar w:fldCharType="separate"/>
+        </w:r>
+        <w:r>
+          <w:rPr>
+            <w:noProof/>
+            <w:webHidden/>
+          </w:rPr>
+          <w:t>12</w:t>
+        </w:r>
+        <w:r>
+          <w:rPr>
+            <w:rFonts w:hint="eastAsia"/>
+            <w:noProof/>
+            <w:webHidden/>
+          </w:rPr>
+          <w:fldChar w:fldCharType="end"/>
+        </w:r>
+      </w:hyperlink>
+    </w:p>
+    <w:p>
+      <w:pPr>
+        <w:pStyle w:val="TOC2"/>
+        <w:tabs>
+          <w:tab w:val="right" w:leader="dot" w:pos="9402"/>
+        </w:tabs>
+        <w:ind w:left="480"/>
+        <w:rPr>
+          <w:rFonts w:asciiTheme="minorHAnsi" w:eastAsiaTheme="minorEastAsia" w:hAnsiTheme="minorHAnsi" w:hint="eastAsia"/>
+          <w:noProof/>
+          <w:kern w:val="2"/>
+          <w:sz w:val="22"/>
+          <w:szCs w:val="24"/>
+          <w:lang w:eastAsia="zh-CN"/>
+          <w14:ligatures w14:val="standardContextual"/>
+        </w:rPr>
+      </w:pPr>
+      <w:hyperlink w:anchor="_Toc243297616" w:history="1">
         <w:r>
           <w:rPr>
             <w:rStyle w:val="aff9"/>
             <w:rFonts w:eastAsia="黑体"/>
             <w:noProof/>
           </w:rPr>
-          <w:t xml:space="preserve"> 2018 </w:t>
+          <w:t xml:space="preserve">9.7 </w:t>
         </w:r>
         <w:r>
           <w:rPr>
@@ -4834,7 +4923,7 @@
             <w:rFonts w:eastAsia="黑体"/>
             <w:noProof/>
           </w:rPr>
-          <w:t>年用</w:t>
+          <w:t>为什么</w:t>
         </w:r>
         <w:r>
           <w:rPr>
@@ -4842,7 +4931,7 @@
             <w:rFonts w:eastAsia="黑体"/>
             <w:noProof/>
           </w:rPr>
-          <w:t xml:space="preserve"> 2017 </w:t>
+          <w:t xml:space="preserve"> 2018 </w:t>
         </w:r>
         <w:r>
           <w:rPr>
@@ -4850,6 +4939,22 @@
             <w:rFonts w:eastAsia="黑体"/>
             <w:noProof/>
           </w:rPr>
+          <w:t>年用</w:t>
+        </w:r>
+        <w:r>
+          <w:rPr>
+            <w:rStyle w:val="aff9"/>
+            <w:rFonts w:eastAsia="黑体"/>
+            <w:noProof/>
+          </w:rPr>
+          <w:t xml:space="preserve"> 2017 </w:t>
+        </w:r>
+        <w:r>
+          <w:rPr>
+            <w:rStyle w:val="aff9"/>
+            <w:rFonts w:eastAsia="黑体"/>
+            <w:noProof/>
+          </w:rPr>
           <w:t>年榜单？</w:t>
         </w:r>
         <w:r>
@@ -4881,7 +4986,7 @@
             <w:noProof/>
             <w:webHidden/>
           </w:rPr>
-          <w:instrText>PAGEREF _Toc243297053 \h</w:instrText>
+          <w:instrText>PAGEREF _Toc243297616 \h</w:instrText>
         </w:r>
         <w:r>
           <w:rPr>
@@ -4939,7 +5044,7 @@
           <w14:ligatures w14:val="standardContextual"/>
         </w:rPr>
       </w:pPr>
-      <w:hyperlink w:anchor="_Toc243297054" w:history="1">
+      <w:hyperlink w:anchor="_Toc243297617" w:history="1">
         <w:r>
           <w:rPr>
             <w:rStyle w:val="aff9"/>
@@ -4993,7 +5098,7 @@
             <w:noProof/>
             <w:webHidden/>
           </w:rPr>
-          <w:instrText>PAGEREF _Toc243297054 \h</w:instrText>
+          <w:instrText>PAGEREF _Toc243297617 \h</w:instrText>
         </w:r>
         <w:r>
           <w:rPr>
@@ -5023,7 +5128,7 @@
             <w:noProof/>
             <w:webHidden/>
           </w:rPr>
-          <w:t>12</w:t>
+          <w:t>13</w:t>
         </w:r>
         <w:r>
           <w:rPr>
@@ -5051,7 +5156,7 @@
           <w14:ligatures w14:val="standardContextual"/>
         </w:rPr>
       </w:pPr>
-      <w:hyperlink w:anchor="_Toc243297055" w:history="1">
+      <w:hyperlink w:anchor="_Toc243297618" w:history="1">
         <w:r>
           <w:rPr>
             <w:rStyle w:val="aff9"/>
@@ -5097,7 +5202,7 @@
             <w:noProof/>
             <w:webHidden/>
           </w:rPr>
-          <w:instrText>PAGEREF _Toc243297055 \h</w:instrText>
+          <w:instrText>PAGEREF _Toc243297618 \h</w:instrText>
         </w:r>
         <w:r>
           <w:rPr>
@@ -5152,7 +5257,7 @@
         <w:pStyle w:val="1"/>
         <w:spacing w:before="280" w:after="120"/>
       </w:pPr>
-      <w:bookmarkStart w:id="0" w:name="_Toc243297009"/>
+      <w:bookmarkStart w:id="0" w:name="_Toc243297571"/>
       <w:r>
         <w:rPr>
           <w:rFonts w:ascii="Times New Roman" w:eastAsia="黑体" w:hAnsi="Times New Roman"/>
@@ -5432,7 +5537,7 @@
         <w:pStyle w:val="1"/>
         <w:spacing w:before="280" w:after="120"/>
       </w:pPr>
-      <w:bookmarkStart w:id="1" w:name="_Toc243297010"/>
+      <w:bookmarkStart w:id="1" w:name="_Toc243297572"/>
       <w:r>
         <w:rPr>
           <w:rFonts w:ascii="Times New Roman" w:eastAsia="黑体" w:hAnsi="Times New Roman"/>
@@ -5662,7 +5767,7 @@
         <w:pStyle w:val="1"/>
         <w:spacing w:before="280" w:after="120"/>
       </w:pPr>
-      <w:bookmarkStart w:id="2" w:name="_Toc243297011"/>
+      <w:bookmarkStart w:id="2" w:name="_Toc243297573"/>
       <w:r>
         <w:rPr>
           <w:rFonts w:ascii="Times New Roman" w:eastAsia="黑体" w:hAnsi="Times New Roman"/>
@@ -6197,10 +6302,524 @@
     </w:p>
     <w:p>
       <w:pPr>
+        <w:pStyle w:val="21"/>
+        <w:spacing w:after="120"/>
+      </w:pPr>
+      <w:bookmarkStart w:id="3" w:name="_Toc243297574"/>
+      <w:r>
+        <w:rPr>
+          <w:rFonts w:ascii="Times New Roman" w:eastAsia="黑体" w:hAnsi="Times New Roman"/>
+          <w:color w:val="000000"/>
+        </w:rPr>
+        <w:t xml:space="preserve">2.1 </w:t>
+      </w:r>
+      <w:r>
+        <w:rPr>
+          <w:rFonts w:ascii="Times New Roman" w:eastAsia="黑体" w:hAnsi="Times New Roman"/>
+          <w:color w:val="000000"/>
+        </w:rPr>
+        <w:t>三个层次</w:t>
+      </w:r>
+      <w:bookmarkEnd w:id="3"/>
+    </w:p>
+    <w:p>
+      <w:r>
+        <w:rPr>
+          <w:color w:val="000000"/>
+        </w:rPr>
+        <w:t xml:space="preserve">PDF </w:t>
+      </w:r>
+      <w:r>
+        <w:rPr>
+          <w:color w:val="000000"/>
+        </w:rPr>
+        <w:t>的四个</w:t>
+      </w:r>
+      <w:r>
+        <w:rPr>
+          <w:color w:val="000000"/>
+        </w:rPr>
+        <w:t xml:space="preserve"> presentation questions </w:t>
+      </w:r>
+      <w:r>
+        <w:rPr>
+          <w:color w:val="000000"/>
+        </w:rPr>
+        <w:t>不是四个研究问题，而是同一个研究问题的四个检验。</w:t>
+      </w:r>
+    </w:p>
+    <w:tbl>
+      <w:tblPr>
+        <w:tblStyle w:val="aff1"/>
+        <w:tblW w:w="0" w:type="auto"/>
+        <w:jc w:val="center"/>
+        <w:tblLook w:val="04A0" w:firstRow="1" w:lastRow="0" w:firstColumn="1" w:lastColumn="0" w:noHBand="0" w:noVBand="1"/>
+      </w:tblPr>
+      <w:tblGrid>
+        <w:gridCol w:w="3137"/>
+        <w:gridCol w:w="3137"/>
+        <w:gridCol w:w="3137"/>
+      </w:tblGrid>
+      <w:tr>
+        <w:trPr>
+          <w:cantSplit/>
+          <w:tblHeader/>
+          <w:jc w:val="center"/>
+        </w:trPr>
+        <w:tc>
+          <w:tcPr>
+            <w:tcW w:w="3137" w:type="dxa"/>
+            <w:shd w:val="clear" w:color="auto" w:fill="F2F2F2"/>
+          </w:tcPr>
+          <w:p>
+            <w:pPr>
+              <w:spacing w:after="40" w:line="276" w:lineRule="auto"/>
+            </w:pPr>
+            <w:r>
+              <w:rPr>
+                <w:b/>
+                <w:color w:val="000000"/>
+                <w:sz w:val="21"/>
+              </w:rPr>
+              <w:t>层次</w:t>
+            </w:r>
+          </w:p>
+        </w:tc>
+        <w:tc>
+          <w:tcPr>
+            <w:tcW w:w="3137" w:type="dxa"/>
+            <w:shd w:val="clear" w:color="auto" w:fill="F2F2F2"/>
+          </w:tcPr>
+          <w:p>
+            <w:pPr>
+              <w:spacing w:after="40" w:line="276" w:lineRule="auto"/>
+            </w:pPr>
+            <w:r>
+              <w:rPr>
+                <w:b/>
+                <w:color w:val="000000"/>
+                <w:sz w:val="21"/>
+              </w:rPr>
+              <w:t>问题</w:t>
+            </w:r>
+          </w:p>
+        </w:tc>
+        <w:tc>
+          <w:tcPr>
+            <w:tcW w:w="3137" w:type="dxa"/>
+            <w:shd w:val="clear" w:color="auto" w:fill="F2F2F2"/>
+          </w:tcPr>
+          <w:p>
+            <w:pPr>
+              <w:spacing w:after="40" w:line="276" w:lineRule="auto"/>
+            </w:pPr>
+            <w:r>
+              <w:rPr>
+                <w:b/>
+                <w:color w:val="000000"/>
+                <w:sz w:val="21"/>
+              </w:rPr>
+              <w:t>出现位置</w:t>
+            </w:r>
+          </w:p>
+        </w:tc>
+      </w:tr>
+      <w:tr>
+        <w:trPr>
+          <w:cantSplit/>
+          <w:jc w:val="center"/>
+        </w:trPr>
+        <w:tc>
+          <w:tcPr>
+            <w:tcW w:w="3137" w:type="dxa"/>
+          </w:tcPr>
+          <w:p>
+            <w:pPr>
+              <w:spacing w:after="40" w:line="276" w:lineRule="auto"/>
+            </w:pPr>
+            <w:r>
+              <w:rPr>
+                <w:color w:val="000000"/>
+                <w:sz w:val="21"/>
+              </w:rPr>
+              <w:t>总研究问题</w:t>
+            </w:r>
+          </w:p>
+        </w:tc>
+        <w:tc>
+          <w:tcPr>
+            <w:tcW w:w="3137" w:type="dxa"/>
+          </w:tcPr>
+          <w:p>
+            <w:pPr>
+              <w:spacing w:after="40" w:line="276" w:lineRule="auto"/>
+            </w:pPr>
+            <w:r>
+              <w:rPr>
+                <w:color w:val="000000"/>
+                <w:sz w:val="21"/>
+              </w:rPr>
+              <w:t>投资者为什么追随明星？信息还是影响力</w:t>
+            </w:r>
+          </w:p>
+        </w:tc>
+        <w:tc>
+          <w:tcPr>
+            <w:tcW w:w="3137" w:type="dxa"/>
+          </w:tcPr>
+          <w:p>
+            <w:pPr>
+              <w:spacing w:after="40" w:line="276" w:lineRule="auto"/>
+            </w:pPr>
+            <w:r>
+              <w:rPr>
+                <w:color w:val="000000"/>
+                <w:sz w:val="21"/>
+              </w:rPr>
+              <w:t>第</w:t>
+            </w:r>
+            <w:r>
+              <w:rPr>
+                <w:color w:val="000000"/>
+                <w:sz w:val="21"/>
+              </w:rPr>
+              <w:t xml:space="preserve"> 1</w:t>
+            </w:r>
+            <w:r>
+              <w:rPr>
+                <w:color w:val="000000"/>
+                <w:sz w:val="21"/>
+              </w:rPr>
+              <w:t>、</w:t>
+            </w:r>
+            <w:r>
+              <w:rPr>
+                <w:color w:val="000000"/>
+                <w:sz w:val="21"/>
+              </w:rPr>
+              <w:t>3</w:t>
+            </w:r>
+            <w:r>
+              <w:rPr>
+                <w:color w:val="000000"/>
+                <w:sz w:val="21"/>
+              </w:rPr>
+              <w:t>、</w:t>
+            </w:r>
+            <w:r>
+              <w:rPr>
+                <w:color w:val="000000"/>
+                <w:sz w:val="21"/>
+              </w:rPr>
+              <w:t xml:space="preserve">13 </w:t>
+            </w:r>
+            <w:r>
+              <w:rPr>
+                <w:color w:val="000000"/>
+                <w:sz w:val="21"/>
+              </w:rPr>
+              <w:t>页</w:t>
+            </w:r>
+          </w:p>
+        </w:tc>
+      </w:tr>
+      <w:tr>
+        <w:trPr>
+          <w:cantSplit/>
+          <w:jc w:val="center"/>
+        </w:trPr>
+        <w:tc>
+          <w:tcPr>
+            <w:tcW w:w="3137" w:type="dxa"/>
+          </w:tcPr>
+          <w:p>
+            <w:pPr>
+              <w:spacing w:after="40" w:line="276" w:lineRule="auto"/>
+            </w:pPr>
+            <w:r>
+              <w:rPr>
+                <w:color w:val="000000"/>
+                <w:sz w:val="21"/>
+              </w:rPr>
+              <w:t>四个检验</w:t>
+            </w:r>
+          </w:p>
+        </w:tc>
+        <w:tc>
+          <w:tcPr>
+            <w:tcW w:w="3137" w:type="dxa"/>
+          </w:tcPr>
+          <w:p>
+            <w:pPr>
+              <w:spacing w:after="40" w:line="276" w:lineRule="auto"/>
+            </w:pPr>
+            <w:r>
+              <w:rPr>
+                <w:color w:val="000000"/>
+                <w:sz w:val="21"/>
+              </w:rPr>
+              <w:t xml:space="preserve">Q1 </w:t>
+            </w:r>
+            <w:r>
+              <w:rPr>
+                <w:color w:val="000000"/>
+                <w:sz w:val="21"/>
+              </w:rPr>
+              <w:t>现象、</w:t>
+            </w:r>
+            <w:r>
+              <w:rPr>
+                <w:color w:val="000000"/>
+                <w:sz w:val="21"/>
+              </w:rPr>
+              <w:t xml:space="preserve">Q2 </w:t>
+            </w:r>
+            <w:r>
+              <w:rPr>
+                <w:color w:val="000000"/>
+                <w:sz w:val="21"/>
+              </w:rPr>
+              <w:t>持续性、</w:t>
+            </w:r>
+            <w:r>
+              <w:rPr>
+                <w:color w:val="000000"/>
+                <w:sz w:val="21"/>
+              </w:rPr>
+              <w:t xml:space="preserve">Q3 </w:t>
+            </w:r>
+            <w:r>
+              <w:rPr>
+                <w:color w:val="000000"/>
+                <w:sz w:val="21"/>
+              </w:rPr>
+              <w:t>准确度、</w:t>
+            </w:r>
+            <w:r>
+              <w:rPr>
+                <w:color w:val="000000"/>
+                <w:sz w:val="21"/>
+              </w:rPr>
+              <w:t xml:space="preserve">Q4 </w:t>
+            </w:r>
+            <w:r>
+              <w:rPr>
+                <w:color w:val="000000"/>
+                <w:sz w:val="21"/>
+              </w:rPr>
+              <w:t>边界</w:t>
+            </w:r>
+          </w:p>
+        </w:tc>
+        <w:tc>
+          <w:tcPr>
+            <w:tcW w:w="3137" w:type="dxa"/>
+          </w:tcPr>
+          <w:p>
+            <w:pPr>
+              <w:spacing w:after="40" w:line="276" w:lineRule="auto"/>
+            </w:pPr>
+            <w:r>
+              <w:rPr>
+                <w:color w:val="000000"/>
+                <w:sz w:val="21"/>
+              </w:rPr>
+              <w:t>第</w:t>
+            </w:r>
+            <w:r>
+              <w:rPr>
+                <w:color w:val="000000"/>
+                <w:sz w:val="21"/>
+              </w:rPr>
+              <w:t xml:space="preserve"> 7 </w:t>
+            </w:r>
+            <w:r>
+              <w:rPr>
+                <w:color w:val="000000"/>
+                <w:sz w:val="21"/>
+              </w:rPr>
+              <w:t>至</w:t>
+            </w:r>
+            <w:r>
+              <w:rPr>
+                <w:color w:val="000000"/>
+                <w:sz w:val="21"/>
+              </w:rPr>
+              <w:t xml:space="preserve"> 11 </w:t>
+            </w:r>
+            <w:r>
+              <w:rPr>
+                <w:color w:val="000000"/>
+                <w:sz w:val="21"/>
+              </w:rPr>
+              <w:t>页</w:t>
+            </w:r>
+          </w:p>
+        </w:tc>
+      </w:tr>
+      <w:tr>
+        <w:trPr>
+          <w:cantSplit/>
+          <w:jc w:val="center"/>
+        </w:trPr>
+        <w:tc>
+          <w:tcPr>
+            <w:tcW w:w="3137" w:type="dxa"/>
+          </w:tcPr>
+          <w:p>
+            <w:pPr>
+              <w:spacing w:after="40" w:line="276" w:lineRule="auto"/>
+            </w:pPr>
+            <w:r>
+              <w:rPr>
+                <w:color w:val="000000"/>
+                <w:sz w:val="21"/>
+              </w:rPr>
+              <w:t>页面问题</w:t>
+            </w:r>
+          </w:p>
+        </w:tc>
+        <w:tc>
+          <w:tcPr>
+            <w:tcW w:w="3137" w:type="dxa"/>
+          </w:tcPr>
+          <w:p>
+            <w:pPr>
+              <w:spacing w:after="40" w:line="276" w:lineRule="auto"/>
+            </w:pPr>
+            <w:r>
+              <w:rPr>
+                <w:color w:val="000000"/>
+                <w:sz w:val="21"/>
+              </w:rPr>
+              <w:t>每个</w:t>
+            </w:r>
+            <w:r>
+              <w:rPr>
+                <w:color w:val="000000"/>
+                <w:sz w:val="21"/>
+              </w:rPr>
+              <w:t xml:space="preserve"> finding </w:t>
+            </w:r>
+            <w:r>
+              <w:rPr>
+                <w:color w:val="000000"/>
+                <w:sz w:val="21"/>
+              </w:rPr>
+              <w:t>只问可测量的那一半</w:t>
+            </w:r>
+          </w:p>
+        </w:tc>
+        <w:tc>
+          <w:tcPr>
+            <w:tcW w:w="3137" w:type="dxa"/>
+          </w:tcPr>
+          <w:p>
+            <w:pPr>
+              <w:spacing w:after="40" w:line="276" w:lineRule="auto"/>
+            </w:pPr>
+            <w:r>
+              <w:rPr>
+                <w:color w:val="000000"/>
+                <w:sz w:val="21"/>
+              </w:rPr>
+              <w:t>eyebrow</w:t>
+            </w:r>
+          </w:p>
+        </w:tc>
+      </w:tr>
+    </w:tbl>
+    <w:p>
+      <w:pPr>
+        <w:spacing w:after="0"/>
+      </w:pPr>
+    </w:p>
+    <w:p>
+      <w:r>
+        <w:rPr>
+          <w:color w:val="000000"/>
+        </w:rPr>
+        <w:t>所以</w:t>
+      </w:r>
+      <w:r>
+        <w:rPr>
+          <w:color w:val="000000"/>
+        </w:rPr>
+        <w:t xml:space="preserve"> Q3 </w:t>
+      </w:r>
+      <w:r>
+        <w:rPr>
+          <w:color w:val="000000"/>
+        </w:rPr>
+        <w:t>不是总研究问题的重复，它是总问题的第三个检验。</w:t>
+      </w:r>
+      <w:r>
+        <w:rPr>
+          <w:color w:val="000000"/>
+        </w:rPr>
+        <w:t xml:space="preserve">PPT </w:t>
+      </w:r>
+      <w:r>
+        <w:rPr>
+          <w:color w:val="000000"/>
+        </w:rPr>
+        <w:t>的</w:t>
+      </w:r>
+      <w:r>
+        <w:rPr>
+          <w:color w:val="000000"/>
+        </w:rPr>
+        <w:t xml:space="preserve"> Q3 eyebrow </w:t>
+      </w:r>
+      <w:r>
+        <w:rPr>
+          <w:color w:val="000000"/>
+        </w:rPr>
+        <w:t>只问</w:t>
+      </w:r>
+      <w:r>
+        <w:rPr>
+          <w:color w:val="000000"/>
+        </w:rPr>
+        <w:t xml:space="preserve"> "Are stars more accurate ex post?"</w:t>
+      </w:r>
+      <w:r>
+        <w:rPr>
+          <w:color w:val="000000"/>
+        </w:rPr>
+        <w:t>，不把</w:t>
+      </w:r>
+      <w:r>
+        <w:rPr>
+          <w:color w:val="000000"/>
+        </w:rPr>
+        <w:t xml:space="preserve"> "or just influencing" </w:t>
+      </w:r>
+      <w:r>
+        <w:rPr>
+          <w:color w:val="000000"/>
+        </w:rPr>
+        <w:t>放进问题；那句话留给第</w:t>
+      </w:r>
+      <w:r>
+        <w:rPr>
+          <w:color w:val="000000"/>
+        </w:rPr>
+        <w:t xml:space="preserve"> 13 </w:t>
+      </w:r>
+      <w:r>
+        <w:rPr>
+          <w:color w:val="000000"/>
+        </w:rPr>
+        <w:t>页的解释。</w:t>
+      </w:r>
+    </w:p>
+    <w:p>
+      <w:pPr>
         <w:pStyle w:val="1"/>
         <w:spacing w:before="280" w:after="120"/>
       </w:pPr>
-      <w:bookmarkStart w:id="3" w:name="_Toc243297012"/>
+      <w:bookmarkStart w:id="4" w:name="_Toc243297575"/>
       <w:r>
         <w:rPr>
           <w:rFonts w:ascii="Times New Roman" w:eastAsia="黑体" w:hAnsi="Times New Roman"/>
@@ -6217,14 +6836,14 @@
         </w:rPr>
         <w:t>：公告日收益与成交量</w:t>
       </w:r>
-      <w:bookmarkEnd w:id="3"/>
+      <w:bookmarkEnd w:id="4"/>
     </w:p>
     <w:p>
       <w:pPr>
         <w:pStyle w:val="21"/>
         <w:spacing w:after="120"/>
       </w:pPr>
-      <w:bookmarkStart w:id="4" w:name="_Toc243297013"/>
+      <w:bookmarkStart w:id="5" w:name="_Toc243297576"/>
       <w:r>
         <w:rPr>
           <w:rFonts w:ascii="Times New Roman" w:eastAsia="黑体" w:hAnsi="Times New Roman"/>
@@ -6239,7 +6858,7 @@
         </w:rPr>
         <w:t>问题原文</w:t>
       </w:r>
-      <w:bookmarkEnd w:id="4"/>
+      <w:bookmarkEnd w:id="5"/>
     </w:p>
     <w:p>
       <w:r>
@@ -6254,7 +6873,7 @@
         <w:pStyle w:val="21"/>
         <w:spacing w:after="120"/>
       </w:pPr>
-      <w:bookmarkStart w:id="5" w:name="_Toc243297014"/>
+      <w:bookmarkStart w:id="6" w:name="_Toc243297577"/>
       <w:r>
         <w:rPr>
           <w:rFonts w:ascii="Times New Roman" w:eastAsia="黑体" w:hAnsi="Times New Roman"/>
@@ -6269,7 +6888,7 @@
         </w:rPr>
         <w:t>问题真正问什么</w:t>
       </w:r>
-      <w:bookmarkEnd w:id="5"/>
+      <w:bookmarkEnd w:id="6"/>
     </w:p>
     <w:p>
       <w:r>
@@ -6394,7 +7013,7 @@
         <w:pStyle w:val="21"/>
         <w:spacing w:after="120"/>
       </w:pPr>
-      <w:bookmarkStart w:id="6" w:name="_Toc243297015"/>
+      <w:bookmarkStart w:id="7" w:name="_Toc243297578"/>
       <w:r>
         <w:rPr>
           <w:rFonts w:ascii="Times New Roman" w:eastAsia="黑体" w:hAnsi="Times New Roman"/>
@@ -6409,7 +7028,7 @@
         </w:rPr>
         <w:t>我们的回答</w:t>
       </w:r>
-      <w:bookmarkEnd w:id="6"/>
+      <w:bookmarkEnd w:id="7"/>
     </w:p>
     <w:p>
       <w:r>
@@ -6441,7 +7060,7 @@
         <w:pStyle w:val="21"/>
         <w:spacing w:after="120"/>
       </w:pPr>
-      <w:bookmarkStart w:id="7" w:name="_Toc243297016"/>
+      <w:bookmarkStart w:id="8" w:name="_Toc243297579"/>
       <w:r>
         <w:rPr>
           <w:rFonts w:ascii="Times New Roman" w:eastAsia="黑体" w:hAnsi="Times New Roman"/>
@@ -6456,7 +7075,7 @@
         </w:rPr>
         <w:t>四个格子</w:t>
       </w:r>
-      <w:bookmarkEnd w:id="7"/>
+      <w:bookmarkEnd w:id="8"/>
     </w:p>
     <w:tbl>
       <w:tblPr>
@@ -6929,7 +7548,7 @@
         <w:pStyle w:val="21"/>
         <w:spacing w:after="120"/>
       </w:pPr>
-      <w:bookmarkStart w:id="8" w:name="_Toc243297017"/>
+      <w:bookmarkStart w:id="9" w:name="_Toc243297580"/>
       <w:r>
         <w:rPr>
           <w:rFonts w:ascii="Times New Roman" w:eastAsia="黑体" w:hAnsi="Times New Roman"/>
@@ -6944,7 +7563,7 @@
         </w:rPr>
         <w:t>底层逻辑</w:t>
       </w:r>
-      <w:bookmarkEnd w:id="8"/>
+      <w:bookmarkEnd w:id="9"/>
     </w:p>
     <w:p>
       <w:r>
@@ -7343,7 +7962,7 @@
         <w:pStyle w:val="21"/>
         <w:spacing w:after="120"/>
       </w:pPr>
-      <w:bookmarkStart w:id="9" w:name="_Toc243297018"/>
+      <w:bookmarkStart w:id="10" w:name="_Toc243297581"/>
       <w:r>
         <w:rPr>
           <w:rFonts w:ascii="Times New Roman" w:eastAsia="黑体" w:hAnsi="Times New Roman"/>
@@ -7358,7 +7977,7 @@
         </w:rPr>
         <w:t>口播</w:t>
       </w:r>
-      <w:bookmarkEnd w:id="9"/>
+      <w:bookmarkEnd w:id="10"/>
     </w:p>
     <w:p>
       <w:r>
@@ -7461,7 +8080,7 @@
         <w:pStyle w:val="21"/>
         <w:spacing w:after="120"/>
       </w:pPr>
-      <w:bookmarkStart w:id="10" w:name="_Toc243297019"/>
+      <w:bookmarkStart w:id="11" w:name="_Toc243297582"/>
       <w:r>
         <w:rPr>
           <w:rFonts w:ascii="Times New Roman" w:eastAsia="黑体" w:hAnsi="Times New Roman"/>
@@ -7476,7 +8095,7 @@
         </w:rPr>
         <w:t>不能说的话</w:t>
       </w:r>
-      <w:bookmarkEnd w:id="10"/>
+      <w:bookmarkEnd w:id="11"/>
     </w:p>
     <w:p>
       <w:pPr>
@@ -7639,7 +8258,7 @@
         <w:pStyle w:val="1"/>
         <w:spacing w:before="280" w:after="120"/>
       </w:pPr>
-      <w:bookmarkStart w:id="11" w:name="_Toc243297020"/>
+      <w:bookmarkStart w:id="12" w:name="_Toc243297583"/>
       <w:r>
         <w:rPr>
           <w:rFonts w:ascii="Times New Roman" w:eastAsia="黑体" w:hAnsi="Times New Roman"/>
@@ -7656,14 +8275,14 @@
         </w:rPr>
         <w:t>：公告后漂移与反转</w:t>
       </w:r>
-      <w:bookmarkEnd w:id="11"/>
+      <w:bookmarkEnd w:id="12"/>
     </w:p>
     <w:p>
       <w:pPr>
         <w:pStyle w:val="21"/>
         <w:spacing w:after="120"/>
       </w:pPr>
-      <w:bookmarkStart w:id="12" w:name="_Toc243297021"/>
+      <w:bookmarkStart w:id="13" w:name="_Toc243297584"/>
       <w:r>
         <w:rPr>
           <w:rFonts w:ascii="Times New Roman" w:eastAsia="黑体" w:hAnsi="Times New Roman"/>
@@ -7678,7 +8297,7 @@
         </w:rPr>
         <w:t>问题原文</w:t>
       </w:r>
-      <w:bookmarkEnd w:id="12"/>
+      <w:bookmarkEnd w:id="13"/>
     </w:p>
     <w:p>
       <w:r>
@@ -7693,7 +8312,7 @@
         <w:pStyle w:val="21"/>
         <w:spacing w:after="120"/>
       </w:pPr>
-      <w:bookmarkStart w:id="13" w:name="_Toc243297022"/>
+      <w:bookmarkStart w:id="14" w:name="_Toc243297585"/>
       <w:r>
         <w:rPr>
           <w:rFonts w:ascii="Times New Roman" w:eastAsia="黑体" w:hAnsi="Times New Roman"/>
@@ -7708,7 +8327,7 @@
         </w:rPr>
         <w:t>问题真正问什么</w:t>
       </w:r>
-      <w:bookmarkEnd w:id="13"/>
+      <w:bookmarkEnd w:id="14"/>
     </w:p>
     <w:p>
       <w:r>
@@ -7905,7 +8524,7 @@
         <w:pStyle w:val="21"/>
         <w:spacing w:after="120"/>
       </w:pPr>
-      <w:bookmarkStart w:id="14" w:name="_Toc243297023"/>
+      <w:bookmarkStart w:id="15" w:name="_Toc243297586"/>
       <w:r>
         <w:rPr>
           <w:rFonts w:ascii="Times New Roman" w:eastAsia="黑体" w:hAnsi="Times New Roman"/>
@@ -7920,7 +8539,7 @@
         </w:rPr>
         <w:t>我们的回答</w:t>
       </w:r>
-      <w:bookmarkEnd w:id="14"/>
+      <w:bookmarkEnd w:id="15"/>
     </w:p>
     <w:p>
       <w:r>
@@ -7952,7 +8571,7 @@
         <w:pStyle w:val="21"/>
         <w:spacing w:after="120"/>
       </w:pPr>
-      <w:bookmarkStart w:id="15" w:name="_Toc243297024"/>
+      <w:bookmarkStart w:id="16" w:name="_Toc243297587"/>
       <w:r>
         <w:rPr>
           <w:rFonts w:ascii="Times New Roman" w:eastAsia="黑体" w:hAnsi="Times New Roman"/>
@@ -7967,7 +8586,7 @@
         </w:rPr>
         <w:t>数字</w:t>
       </w:r>
-      <w:bookmarkEnd w:id="15"/>
+      <w:bookmarkEnd w:id="16"/>
     </w:p>
     <w:tbl>
       <w:tblPr>
@@ -8391,7 +9010,7 @@
         <w:pStyle w:val="21"/>
         <w:spacing w:after="120"/>
       </w:pPr>
-      <w:bookmarkStart w:id="16" w:name="_Toc243297025"/>
+      <w:bookmarkStart w:id="17" w:name="_Toc243297588"/>
       <w:r>
         <w:rPr>
           <w:rFonts w:ascii="Times New Roman" w:eastAsia="黑体" w:hAnsi="Times New Roman"/>
@@ -8406,7 +9025,7 @@
         </w:rPr>
         <w:t>底层逻辑</w:t>
       </w:r>
-      <w:bookmarkEnd w:id="16"/>
+      <w:bookmarkEnd w:id="17"/>
     </w:p>
     <w:p>
       <w:r>
@@ -8661,7 +9280,7 @@
         <w:pStyle w:val="21"/>
         <w:spacing w:after="120"/>
       </w:pPr>
-      <w:bookmarkStart w:id="17" w:name="_Toc243297026"/>
+      <w:bookmarkStart w:id="18" w:name="_Toc243297589"/>
       <w:r>
         <w:rPr>
           <w:rFonts w:ascii="Times New Roman" w:eastAsia="黑体" w:hAnsi="Times New Roman"/>
@@ -8676,7 +9295,7 @@
         </w:rPr>
         <w:t>口播</w:t>
       </w:r>
-      <w:bookmarkEnd w:id="17"/>
+      <w:bookmarkEnd w:id="18"/>
     </w:p>
     <w:p>
       <w:r>
@@ -8821,7 +9440,7 @@
         <w:pStyle w:val="21"/>
         <w:spacing w:after="120"/>
       </w:pPr>
-      <w:bookmarkStart w:id="18" w:name="_Toc243297027"/>
+      <w:bookmarkStart w:id="19" w:name="_Toc243297590"/>
       <w:r>
         <w:rPr>
           <w:rFonts w:ascii="Times New Roman" w:eastAsia="黑体" w:hAnsi="Times New Roman"/>
@@ -8836,7 +9455,7 @@
         </w:rPr>
         <w:t>不能说的话</w:t>
       </w:r>
-      <w:bookmarkEnd w:id="18"/>
+      <w:bookmarkEnd w:id="19"/>
     </w:p>
     <w:p>
       <w:pPr>
@@ -8975,7 +9594,7 @@
         <w:pStyle w:val="1"/>
         <w:spacing w:before="280" w:after="120"/>
       </w:pPr>
-      <w:bookmarkStart w:id="19" w:name="_Toc243297028"/>
+      <w:bookmarkStart w:id="20" w:name="_Toc243297591"/>
       <w:r>
         <w:rPr>
           <w:rFonts w:ascii="Times New Roman" w:eastAsia="黑体" w:hAnsi="Times New Roman"/>
@@ -8990,16 +9609,16 @@
           <w:color w:val="000000"/>
           <w:sz w:val="30"/>
         </w:rPr>
-        <w:t>：更准，还是只是影响市场</w:t>
-      </w:r>
-      <w:bookmarkEnd w:id="19"/>
+        <w:t>：明星是否更准</w:t>
+      </w:r>
+      <w:bookmarkEnd w:id="20"/>
     </w:p>
     <w:p>
       <w:pPr>
         <w:pStyle w:val="21"/>
         <w:spacing w:after="120"/>
       </w:pPr>
-      <w:bookmarkStart w:id="20" w:name="_Toc243297029"/>
+      <w:bookmarkStart w:id="21" w:name="_Toc243297592"/>
       <w:r>
         <w:rPr>
           <w:rFonts w:ascii="Times New Roman" w:eastAsia="黑体" w:hAnsi="Times New Roman"/>
@@ -9014,7 +9633,7 @@
         </w:rPr>
         <w:t>问题原文</w:t>
       </w:r>
-      <w:bookmarkEnd w:id="20"/>
+      <w:bookmarkEnd w:id="21"/>
     </w:p>
     <w:p>
       <w:r>
@@ -9029,7 +9648,7 @@
         <w:pStyle w:val="21"/>
         <w:spacing w:after="120"/>
       </w:pPr>
-      <w:bookmarkStart w:id="21" w:name="_Toc243297030"/>
+      <w:bookmarkStart w:id="22" w:name="_Toc243297593"/>
       <w:r>
         <w:rPr>
           <w:rFonts w:ascii="Times New Roman" w:eastAsia="黑体" w:hAnsi="Times New Roman"/>
@@ -9044,7 +9663,105 @@
         </w:rPr>
         <w:t>问题真正问什么</w:t>
       </w:r>
-      <w:bookmarkEnd w:id="21"/>
+      <w:bookmarkEnd w:id="22"/>
+    </w:p>
+    <w:p>
+      <w:r>
+        <w:rPr>
+          <w:color w:val="000000"/>
+        </w:rPr>
+        <w:t xml:space="preserve">PDF </w:t>
+      </w:r>
+      <w:r>
+        <w:rPr>
+          <w:color w:val="000000"/>
+        </w:rPr>
+        <w:t>原问题包含</w:t>
+      </w:r>
+      <w:r>
+        <w:rPr>
+          <w:color w:val="000000"/>
+        </w:rPr>
+        <w:t xml:space="preserve"> "or are they just influencing markets?"</w:t>
+      </w:r>
+      <w:r>
+        <w:rPr>
+          <w:color w:val="000000"/>
+        </w:rPr>
+        <w:t>。这句话是研究问题的解释层，不是</w:t>
+      </w:r>
+      <w:r>
+        <w:rPr>
+          <w:color w:val="000000"/>
+        </w:rPr>
+        <w:t xml:space="preserve"> Q3 </w:t>
+      </w:r>
+      <w:r>
+        <w:rPr>
+          <w:color w:val="000000"/>
+        </w:rPr>
+        <w:t>的测量问题。</w:t>
+      </w:r>
+      <w:r>
+        <w:rPr>
+          <w:color w:val="000000"/>
+        </w:rPr>
+        <w:t xml:space="preserve">PPT </w:t>
+      </w:r>
+      <w:r>
+        <w:rPr>
+          <w:color w:val="000000"/>
+        </w:rPr>
+        <w:t>的</w:t>
+      </w:r>
+      <w:r>
+        <w:rPr>
+          <w:color w:val="000000"/>
+        </w:rPr>
+        <w:t xml:space="preserve"> Q3 </w:t>
+      </w:r>
+      <w:r>
+        <w:rPr>
+          <w:color w:val="000000"/>
+        </w:rPr>
+        <w:t>只问</w:t>
+      </w:r>
+      <w:r>
+        <w:rPr>
+          <w:color w:val="000000"/>
+        </w:rPr>
+        <w:t xml:space="preserve"> "Are stars more accurate ex post?"</w:t>
+      </w:r>
+      <w:r>
+        <w:rPr>
+          <w:color w:val="000000"/>
+        </w:rPr>
+        <w:t>，把</w:t>
+      </w:r>
+      <w:r>
+        <w:rPr>
+          <w:color w:val="000000"/>
+        </w:rPr>
+        <w:t xml:space="preserve"> "or just influencing" </w:t>
+      </w:r>
+      <w:r>
+        <w:rPr>
+          <w:color w:val="000000"/>
+        </w:rPr>
+        <w:t>留给第</w:t>
+      </w:r>
+      <w:r>
+        <w:rPr>
+          <w:color w:val="000000"/>
+        </w:rPr>
+        <w:t xml:space="preserve"> 13 </w:t>
+      </w:r>
+      <w:r>
+        <w:rPr>
+          <w:color w:val="000000"/>
+        </w:rPr>
+        <w:t>页。</w:t>
+      </w:r>
     </w:p>
     <w:p>
       <w:r>
@@ -9205,7 +9922,7 @@
         <w:pStyle w:val="21"/>
         <w:spacing w:after="120"/>
       </w:pPr>
-      <w:bookmarkStart w:id="22" w:name="_Toc243297031"/>
+      <w:bookmarkStart w:id="23" w:name="_Toc243297594"/>
       <w:r>
         <w:rPr>
           <w:rFonts w:ascii="Times New Roman" w:eastAsia="黑体" w:hAnsi="Times New Roman"/>
@@ -9220,7 +9937,7 @@
         </w:rPr>
         <w:t>我们的回答</w:t>
       </w:r>
-      <w:bookmarkEnd w:id="22"/>
+      <w:bookmarkEnd w:id="23"/>
     </w:p>
     <w:p>
       <w:r>
@@ -9252,7 +9969,7 @@
         <w:pStyle w:val="21"/>
         <w:spacing w:after="120"/>
       </w:pPr>
-      <w:bookmarkStart w:id="23" w:name="_Toc243297032"/>
+      <w:bookmarkStart w:id="24" w:name="_Toc243297595"/>
       <w:r>
         <w:rPr>
           <w:rFonts w:ascii="Times New Roman" w:eastAsia="黑体" w:hAnsi="Times New Roman"/>
@@ -9267,7 +9984,7 @@
         </w:rPr>
         <w:t>数字</w:t>
       </w:r>
-      <w:bookmarkEnd w:id="23"/>
+      <w:bookmarkEnd w:id="24"/>
     </w:p>
     <w:p>
       <w:r>
@@ -10031,7 +10748,7 @@
         <w:pStyle w:val="21"/>
         <w:spacing w:after="120"/>
       </w:pPr>
-      <w:bookmarkStart w:id="24" w:name="_Toc243297033"/>
+      <w:bookmarkStart w:id="25" w:name="_Toc243297596"/>
       <w:r>
         <w:rPr>
           <w:rFonts w:ascii="Times New Roman" w:eastAsia="黑体" w:hAnsi="Times New Roman"/>
@@ -10046,7 +10763,7 @@
         </w:rPr>
         <w:t>底层逻辑</w:t>
       </w:r>
-      <w:bookmarkEnd w:id="24"/>
+      <w:bookmarkEnd w:id="25"/>
     </w:p>
     <w:p>
       <w:r>
@@ -10301,7 +11018,7 @@
         <w:pStyle w:val="21"/>
         <w:spacing w:after="120"/>
       </w:pPr>
-      <w:bookmarkStart w:id="25" w:name="_Toc243297034"/>
+      <w:bookmarkStart w:id="26" w:name="_Toc243297597"/>
       <w:r>
         <w:rPr>
           <w:rFonts w:ascii="Times New Roman" w:eastAsia="黑体" w:hAnsi="Times New Roman"/>
@@ -10316,7 +11033,7 @@
         </w:rPr>
         <w:t>口播</w:t>
       </w:r>
-      <w:bookmarkEnd w:id="25"/>
+      <w:bookmarkEnd w:id="26"/>
     </w:p>
     <w:p>
       <w:r>
@@ -10401,7 +11118,7 @@
         <w:pStyle w:val="21"/>
         <w:spacing w:after="120"/>
       </w:pPr>
-      <w:bookmarkStart w:id="26" w:name="_Toc243297035"/>
+      <w:bookmarkStart w:id="27" w:name="_Toc243297598"/>
       <w:r>
         <w:rPr>
           <w:rFonts w:ascii="Times New Roman" w:eastAsia="黑体" w:hAnsi="Times New Roman"/>
@@ -10416,7 +11133,7 @@
         </w:rPr>
         <w:t>不能说的话</w:t>
       </w:r>
-      <w:bookmarkEnd w:id="26"/>
+      <w:bookmarkEnd w:id="27"/>
     </w:p>
     <w:p>
       <w:pPr>
@@ -10543,7 +11260,7 @@
         <w:pStyle w:val="1"/>
         <w:spacing w:before="280" w:after="120"/>
       </w:pPr>
-      <w:bookmarkStart w:id="27" w:name="_Toc243297036"/>
+      <w:bookmarkStart w:id="28" w:name="_Toc243297599"/>
       <w:r>
         <w:rPr>
           <w:rFonts w:ascii="Times New Roman" w:eastAsia="黑体" w:hAnsi="Times New Roman"/>
@@ -10560,14 +11277,14 @@
         </w:rPr>
         <w:t>：方向与券商层级</w:t>
       </w:r>
-      <w:bookmarkEnd w:id="27"/>
+      <w:bookmarkEnd w:id="28"/>
     </w:p>
     <w:p>
       <w:pPr>
         <w:pStyle w:val="21"/>
         <w:spacing w:after="120"/>
       </w:pPr>
-      <w:bookmarkStart w:id="28" w:name="_Toc243297037"/>
+      <w:bookmarkStart w:id="29" w:name="_Toc243297600"/>
       <w:r>
         <w:rPr>
           <w:rFonts w:ascii="Times New Roman" w:eastAsia="黑体" w:hAnsi="Times New Roman"/>
@@ -10582,7 +11299,7 @@
         </w:rPr>
         <w:t>问题原文</w:t>
       </w:r>
-      <w:bookmarkEnd w:id="28"/>
+      <w:bookmarkEnd w:id="29"/>
     </w:p>
     <w:p>
       <w:r>
@@ -10597,7 +11314,7 @@
         <w:pStyle w:val="21"/>
         <w:spacing w:after="120"/>
       </w:pPr>
-      <w:bookmarkStart w:id="29" w:name="_Toc243297038"/>
+      <w:bookmarkStart w:id="30" w:name="_Toc243297601"/>
       <w:r>
         <w:rPr>
           <w:rFonts w:ascii="Times New Roman" w:eastAsia="黑体" w:hAnsi="Times New Roman"/>
@@ -10612,7 +11329,7 @@
         </w:rPr>
         <w:t>问题真正问什么</w:t>
       </w:r>
-      <w:bookmarkEnd w:id="29"/>
+      <w:bookmarkEnd w:id="30"/>
     </w:p>
     <w:p>
       <w:r>
@@ -10719,7 +11436,7 @@
         <w:pStyle w:val="21"/>
         <w:spacing w:after="120"/>
       </w:pPr>
-      <w:bookmarkStart w:id="30" w:name="_Toc243297039"/>
+      <w:bookmarkStart w:id="31" w:name="_Toc243297602"/>
       <w:r>
         <w:rPr>
           <w:rFonts w:ascii="Times New Roman" w:eastAsia="黑体" w:hAnsi="Times New Roman"/>
@@ -10734,7 +11451,7 @@
         </w:rPr>
         <w:t>我们的回答</w:t>
       </w:r>
-      <w:bookmarkEnd w:id="30"/>
+      <w:bookmarkEnd w:id="31"/>
     </w:p>
     <w:p>
       <w:r>
@@ -10766,7 +11483,7 @@
         <w:pStyle w:val="21"/>
         <w:spacing w:after="120"/>
       </w:pPr>
-      <w:bookmarkStart w:id="31" w:name="_Toc243297040"/>
+      <w:bookmarkStart w:id="32" w:name="_Toc243297603"/>
       <w:r>
         <w:rPr>
           <w:rFonts w:ascii="Times New Roman" w:eastAsia="黑体" w:hAnsi="Times New Roman"/>
@@ -10781,7 +11498,7 @@
         </w:rPr>
         <w:t>数字</w:t>
       </w:r>
-      <w:bookmarkEnd w:id="31"/>
+      <w:bookmarkEnd w:id="32"/>
     </w:p>
     <w:p>
       <w:r>
@@ -11345,7 +12062,7 @@
         <w:pStyle w:val="21"/>
         <w:spacing w:after="120"/>
       </w:pPr>
-      <w:bookmarkStart w:id="32" w:name="_Toc243297041"/>
+      <w:bookmarkStart w:id="33" w:name="_Toc243297604"/>
       <w:r>
         <w:rPr>
           <w:rFonts w:ascii="Times New Roman" w:eastAsia="黑体" w:hAnsi="Times New Roman"/>
@@ -11360,7 +12077,7 @@
         </w:rPr>
         <w:t>底层逻辑</w:t>
       </w:r>
-      <w:bookmarkEnd w:id="32"/>
+      <w:bookmarkEnd w:id="33"/>
     </w:p>
     <w:p>
       <w:r>
@@ -11483,7 +12200,7 @@
         <w:pStyle w:val="21"/>
         <w:spacing w:after="120"/>
       </w:pPr>
-      <w:bookmarkStart w:id="33" w:name="_Toc243297042"/>
+      <w:bookmarkStart w:id="34" w:name="_Toc243297605"/>
       <w:r>
         <w:rPr>
           <w:rFonts w:ascii="Times New Roman" w:eastAsia="黑体" w:hAnsi="Times New Roman"/>
@@ -11498,7 +12215,7 @@
         </w:rPr>
         <w:t>口播</w:t>
       </w:r>
-      <w:bookmarkEnd w:id="33"/>
+      <w:bookmarkEnd w:id="34"/>
     </w:p>
     <w:p>
       <w:r>
@@ -11595,7 +12312,7 @@
         <w:pStyle w:val="21"/>
         <w:spacing w:after="120"/>
       </w:pPr>
-      <w:bookmarkStart w:id="34" w:name="_Toc243297043"/>
+      <w:bookmarkStart w:id="35" w:name="_Toc243297606"/>
       <w:r>
         <w:rPr>
           <w:rFonts w:ascii="Times New Roman" w:eastAsia="黑体" w:hAnsi="Times New Roman"/>
@@ -11610,7 +12327,7 @@
         </w:rPr>
         <w:t>不能说的话</w:t>
       </w:r>
-      <w:bookmarkEnd w:id="34"/>
+      <w:bookmarkEnd w:id="35"/>
     </w:p>
     <w:p>
       <w:pPr>
@@ -11689,7 +12406,7 @@
         <w:pStyle w:val="1"/>
         <w:spacing w:before="280" w:after="120"/>
       </w:pPr>
-      <w:bookmarkStart w:id="35" w:name="_Toc243297044"/>
+      <w:bookmarkStart w:id="36" w:name="_Toc243297607"/>
       <w:r>
         <w:rPr>
           <w:rFonts w:ascii="Times New Roman" w:eastAsia="黑体" w:hAnsi="Times New Roman"/>
@@ -11706,7 +12423,7 @@
         </w:rPr>
         <w:t>四个回答合起来</w:t>
       </w:r>
-      <w:bookmarkEnd w:id="35"/>
+      <w:bookmarkEnd w:id="36"/>
     </w:p>
     <w:tbl>
       <w:tblPr>
@@ -12267,7 +12984,7 @@
         <w:pStyle w:val="1"/>
         <w:spacing w:before="280" w:after="120"/>
       </w:pPr>
-      <w:bookmarkStart w:id="36" w:name="_Toc243297045"/>
+      <w:bookmarkStart w:id="37" w:name="_Toc243297608"/>
       <w:r>
         <w:rPr>
           <w:rFonts w:ascii="Times New Roman" w:eastAsia="黑体" w:hAnsi="Times New Roman"/>
@@ -12284,7 +13001,7 @@
         </w:rPr>
         <w:t>每页一句话与过渡</w:t>
       </w:r>
-      <w:bookmarkEnd w:id="36"/>
+      <w:bookmarkEnd w:id="37"/>
     </w:p>
     <w:tbl>
       <w:tblPr>
@@ -12842,7 +13559,7 @@
         <w:pStyle w:val="1"/>
         <w:spacing w:before="280" w:after="120"/>
       </w:pPr>
-      <w:bookmarkStart w:id="37" w:name="_Toc243297046"/>
+      <w:bookmarkStart w:id="38" w:name="_Toc243297609"/>
       <w:r>
         <w:rPr>
           <w:rFonts w:ascii="Times New Roman" w:eastAsia="黑体" w:hAnsi="Times New Roman"/>
@@ -12859,14 +13576,14 @@
         </w:rPr>
         <w:t>防守</w:t>
       </w:r>
-      <w:bookmarkEnd w:id="37"/>
+      <w:bookmarkEnd w:id="38"/>
     </w:p>
     <w:p>
       <w:pPr>
         <w:pStyle w:val="21"/>
         <w:spacing w:after="120"/>
       </w:pPr>
-      <w:bookmarkStart w:id="38" w:name="_Toc243297047"/>
+      <w:bookmarkStart w:id="39" w:name="_Toc243297610"/>
       <w:r>
         <w:rPr>
           <w:rFonts w:ascii="Times New Roman" w:eastAsia="黑体" w:hAnsi="Times New Roman"/>
@@ -12895,7 +13612,7 @@
         </w:rPr>
         <w:t>有多大？</w:t>
       </w:r>
-      <w:bookmarkEnd w:id="38"/>
+      <w:bookmarkEnd w:id="39"/>
     </w:p>
     <w:p>
       <w:r>
@@ -12964,7 +13681,7 @@
         <w:pStyle w:val="21"/>
         <w:spacing w:after="120"/>
       </w:pPr>
-      <w:bookmarkStart w:id="39" w:name="_Toc243297048"/>
+      <w:bookmarkStart w:id="40" w:name="_Toc243297611"/>
       <w:r>
         <w:rPr>
           <w:rFonts w:ascii="Times New Roman" w:eastAsia="黑体" w:hAnsi="Times New Roman"/>
@@ -12979,7 +13696,7 @@
         </w:rPr>
         <w:t>成交量对涨跌停稳健吗？</w:t>
       </w:r>
-      <w:bookmarkEnd w:id="39"/>
+      <w:bookmarkEnd w:id="40"/>
     </w:p>
     <w:p>
       <w:r>
@@ -13030,7 +13747,7 @@
         <w:pStyle w:val="21"/>
         <w:spacing w:after="120"/>
       </w:pPr>
-      <w:bookmarkStart w:id="40" w:name="_Toc243297049"/>
+      <w:bookmarkStart w:id="41" w:name="_Toc243297612"/>
       <w:r>
         <w:rPr>
           <w:rFonts w:ascii="Times New Roman" w:eastAsia="黑体" w:hAnsi="Times New Roman"/>
@@ -13045,7 +13762,7 @@
         </w:rPr>
         <w:t>短期持有收益支持明星，为什么还说是影响力？</w:t>
       </w:r>
-      <w:bookmarkEnd w:id="40"/>
+      <w:bookmarkEnd w:id="41"/>
     </w:p>
     <w:p>
       <w:r>
@@ -13120,7 +13837,7 @@
         <w:pStyle w:val="21"/>
         <w:spacing w:after="120"/>
       </w:pPr>
-      <w:bookmarkStart w:id="41" w:name="_Toc243297050"/>
+      <w:bookmarkStart w:id="42" w:name="_Toc243297613"/>
       <w:r>
         <w:rPr>
           <w:rFonts w:ascii="Times New Roman" w:eastAsia="黑体" w:hAnsi="Times New Roman"/>
@@ -13135,7 +13852,7 @@
         </w:rPr>
         <w:t>为什么不是过度反应？</w:t>
       </w:r>
-      <w:bookmarkEnd w:id="41"/>
+      <w:bookmarkEnd w:id="42"/>
     </w:p>
     <w:p>
       <w:r>
@@ -13210,7 +13927,7 @@
         <w:pStyle w:val="21"/>
         <w:spacing w:after="120"/>
       </w:pPr>
-      <w:bookmarkStart w:id="42" w:name="_Toc243297051"/>
+      <w:bookmarkStart w:id="43" w:name="_Toc243297614"/>
       <w:r>
         <w:rPr>
           <w:rFonts w:ascii="Times New Roman" w:eastAsia="黑体" w:hAnsi="Times New Roman"/>
@@ -13225,7 +13942,7 @@
         </w:rPr>
         <w:t>为什么层级不稳定？</w:t>
       </w:r>
-      <w:bookmarkEnd w:id="42"/>
+      <w:bookmarkEnd w:id="43"/>
     </w:p>
     <w:p>
       <w:r>
@@ -13312,7 +14029,7 @@
         <w:pStyle w:val="21"/>
         <w:spacing w:after="120"/>
       </w:pPr>
-      <w:bookmarkStart w:id="43" w:name="_Toc243297052"/>
+      <w:bookmarkStart w:id="44" w:name="_Toc243297615"/>
       <w:r>
         <w:rPr>
           <w:rFonts w:ascii="Times New Roman" w:eastAsia="黑体" w:hAnsi="Times New Roman"/>
@@ -13327,7 +14044,7 @@
         </w:rPr>
         <w:t>多重检验怎么办？</w:t>
       </w:r>
-      <w:bookmarkEnd w:id="43"/>
+      <w:bookmarkEnd w:id="44"/>
     </w:p>
     <w:p>
       <w:r>
@@ -13426,7 +14143,7 @@
         <w:pStyle w:val="21"/>
         <w:spacing w:after="120"/>
       </w:pPr>
-      <w:bookmarkStart w:id="44" w:name="_Toc243297053"/>
+      <w:bookmarkStart w:id="45" w:name="_Toc243297616"/>
       <w:r>
         <w:rPr>
           <w:rFonts w:ascii="Times New Roman" w:eastAsia="黑体" w:hAnsi="Times New Roman"/>
@@ -13469,7 +14186,7 @@
         </w:rPr>
         <w:t>年榜单？</w:t>
       </w:r>
-      <w:bookmarkEnd w:id="44"/>
+      <w:bookmarkEnd w:id="45"/>
     </w:p>
     <w:p>
       <w:r>
@@ -13574,7 +14291,7 @@
         <w:pStyle w:val="1"/>
         <w:spacing w:before="280" w:after="120"/>
       </w:pPr>
-      <w:bookmarkStart w:id="45" w:name="_Toc243297054"/>
+      <w:bookmarkStart w:id="46" w:name="_Toc243297617"/>
       <w:r>
         <w:rPr>
           <w:rFonts w:ascii="Times New Roman" w:eastAsia="黑体" w:hAnsi="Times New Roman"/>
@@ -13599,7 +14316,7 @@
         </w:rPr>
         <w:t xml:space="preserve"> checklist</w:t>
       </w:r>
-      <w:bookmarkEnd w:id="45"/>
+      <w:bookmarkEnd w:id="46"/>
     </w:p>
     <w:p>
       <w:pPr>
@@ -13990,7 +14707,7 @@
         <w:pStyle w:val="1"/>
         <w:spacing w:before="280" w:after="120"/>
       </w:pPr>
-      <w:bookmarkStart w:id="46" w:name="_Toc243297055"/>
+      <w:bookmarkStart w:id="47" w:name="_Toc243297618"/>
       <w:r>
         <w:rPr>
           <w:rFonts w:ascii="Times New Roman" w:eastAsia="黑体" w:hAnsi="Times New Roman"/>
@@ -14007,7 +14724,7 @@
         </w:rPr>
         <w:t>参考</w:t>
       </w:r>
-      <w:bookmarkEnd w:id="46"/>
+      <w:bookmarkEnd w:id="47"/>
     </w:p>
     <w:p>
       <w:pPr>
@@ -14526,31 +15243,31 @@
       </w:rPr>
     </w:lvl>
   </w:abstractNum>
-  <w:num w:numId="1" w16cid:durableId="1310282092">
+  <w:num w:numId="1" w16cid:durableId="1720014683">
     <w:abstractNumId w:val="8"/>
   </w:num>
-  <w:num w:numId="2" w16cid:durableId="1901094412">
+  <w:num w:numId="2" w16cid:durableId="1827626452">
     <w:abstractNumId w:val="6"/>
   </w:num>
-  <w:num w:numId="3" w16cid:durableId="183982440">
+  <w:num w:numId="3" w16cid:durableId="1327706217">
     <w:abstractNumId w:val="5"/>
   </w:num>
-  <w:num w:numId="4" w16cid:durableId="116609456">
+  <w:num w:numId="4" w16cid:durableId="6954684">
     <w:abstractNumId w:val="4"/>
   </w:num>
-  <w:num w:numId="5" w16cid:durableId="2048751497">
+  <w:num w:numId="5" w16cid:durableId="917250117">
     <w:abstractNumId w:val="7"/>
   </w:num>
-  <w:num w:numId="6" w16cid:durableId="1064134466">
+  <w:num w:numId="6" w16cid:durableId="829296584">
     <w:abstractNumId w:val="3"/>
   </w:num>
-  <w:num w:numId="7" w16cid:durableId="1357729903">
+  <w:num w:numId="7" w16cid:durableId="842670574">
     <w:abstractNumId w:val="2"/>
   </w:num>
-  <w:num w:numId="8" w16cid:durableId="248465360">
+  <w:num w:numId="8" w16cid:durableId="1731071575">
     <w:abstractNumId w:val="1"/>
   </w:num>
-  <w:num w:numId="9" w16cid:durableId="2111702899">
+  <w:num w:numId="9" w16cid:durableId="278267881">
     <w:abstractNumId w:val="0"/>
   </w:num>
 </w:numbering>
@@ -25949,7 +26666,7 @@
     <w:autoRedefine/>
     <w:uiPriority w:val="39"/>
     <w:unhideWhenUsed/>
-    <w:rsid w:val="008976E5"/>
+    <w:rsid w:val="005E54A9"/>
   </w:style>
   <w:style w:type="paragraph" w:styleId="TOC2">
     <w:name w:val="toc 2"/>
@@ -25958,7 +26675,7 @@
     <w:autoRedefine/>
     <w:uiPriority w:val="39"/>
     <w:unhideWhenUsed/>
-    <w:rsid w:val="008976E5"/>
+    <w:rsid w:val="005E54A9"/>
     <w:pPr>
       <w:ind w:leftChars="200" w:left="420"/>
     </w:pPr>
@@ -25968,7 +26685,7 @@
     <w:basedOn w:val="a2"/>
     <w:uiPriority w:val="99"/>
     <w:unhideWhenUsed/>
-    <w:rsid w:val="008976E5"/>
+    <w:rsid w:val="005E54A9"/>
     <w:rPr>
       <w:color w:val="0000FF" w:themeColor="hyperlink"/>
       <w:u w:val="single"/>

</xml_diff>